<commit_message>
reduxjs toolkit: diagram upload
</commit_message>
<xml_diff>
--- a/images/redux.docx
+++ b/images/redux.docx
@@ -10,18 +10,894 @@
         <mc:AlternateContent>
           <mc:Choice Requires="wps">
             <w:drawing>
-              <wp:anchor distT="0" distB="0" distL="114300" distR="114300" simplePos="0" relativeHeight="251659264" behindDoc="0" locked="0" layoutInCell="1" allowOverlap="1" wp14:anchorId="4D4505F9" wp14:editId="10B34914">
+              <wp:anchor distT="0" distB="0" distL="114300" distR="114300" simplePos="0" relativeHeight="251706368" behindDoc="0" locked="0" layoutInCell="1" allowOverlap="1" wp14:anchorId="48CD5F70" wp14:editId="109D8217">
                 <wp:simplePos x="0" y="0"/>
                 <wp:positionH relativeFrom="column">
-                  <wp:posOffset>2302510</wp:posOffset>
+                  <wp:posOffset>-414867</wp:posOffset>
                 </wp:positionH>
                 <wp:positionV relativeFrom="paragraph">
-                  <wp:posOffset>-584200</wp:posOffset>
+                  <wp:posOffset>-211667</wp:posOffset>
                 </wp:positionV>
-                <wp:extent cx="4182110" cy="2489200"/>
-                <wp:effectExtent l="0" t="0" r="27940" b="25400"/>
+                <wp:extent cx="3327400" cy="266700"/>
+                <wp:effectExtent l="0" t="0" r="25400" b="19050"/>
                 <wp:wrapNone/>
-                <wp:docPr id="1920801241" name="Rectangle 1"/>
+                <wp:docPr id="2034359818" name="Text Box 36"/>
+                <wp:cNvGraphicFramePr/>
+                <a:graphic xmlns:a="http://schemas.openxmlformats.org/drawingml/2006/main">
+                  <a:graphicData uri="http://schemas.microsoft.com/office/word/2010/wordprocessingShape">
+                    <wps:wsp>
+                      <wps:cNvSpPr txBox="1"/>
+                      <wps:spPr>
+                        <a:xfrm>
+                          <a:off x="0" y="0"/>
+                          <a:ext cx="3327400" cy="266700"/>
+                        </a:xfrm>
+                        <a:prstGeom prst="rect">
+                          <a:avLst/>
+                        </a:prstGeom>
+                        <a:solidFill>
+                          <a:schemeClr val="lt1"/>
+                        </a:solidFill>
+                        <a:ln w="6350">
+                          <a:solidFill>
+                            <a:prstClr val="black"/>
+                          </a:solidFill>
+                        </a:ln>
+                      </wps:spPr>
+                      <wps:txbx>
+                        <w:txbxContent>
+                          <w:p>
+                            <w:pPr>
+                              <w:rPr>
+                                <w:sz w:val="16"/>
+                                <w:szCs w:val="16"/>
+                              </w:rPr>
+                            </w:pPr>
+                            <w:proofErr w:type="spellStart"/>
+                            <w:r>
+                              <w:rPr>
+                                <w:sz w:val="16"/>
+                                <w:szCs w:val="16"/>
+                              </w:rPr>
+                              <w:t>const</w:t>
+                            </w:r>
+                            <w:proofErr w:type="spellEnd"/>
+                            <w:r>
+                              <w:rPr>
+                                <w:sz w:val="16"/>
+                                <w:szCs w:val="16"/>
+                              </w:rPr>
+                              <w:t xml:space="preserve"> {count}= </w:t>
+                            </w:r>
+                            <w:proofErr w:type="spellStart"/>
+                            <w:proofErr w:type="gramStart"/>
+                            <w:r>
+                              <w:rPr>
+                                <w:sz w:val="16"/>
+                                <w:szCs w:val="16"/>
+                              </w:rPr>
+                              <w:t>use</w:t>
+                            </w:r>
+                            <w:r>
+                              <w:rPr>
+                                <w:sz w:val="16"/>
+                                <w:szCs w:val="16"/>
+                              </w:rPr>
+                              <w:t>Typed</w:t>
+                            </w:r>
+                            <w:r>
+                              <w:rPr>
+                                <w:sz w:val="16"/>
+                                <w:szCs w:val="16"/>
+                              </w:rPr>
+                              <w:t>Selector</w:t>
+                            </w:r>
+                            <w:proofErr w:type="spellEnd"/>
+                            <w:r>
+                              <w:rPr>
+                                <w:sz w:val="16"/>
+                                <w:szCs w:val="16"/>
+                              </w:rPr>
+                              <w:t>(</w:t>
+                            </w:r>
+                            <w:r>
+                              <w:rPr>
+                                <w:sz w:val="16"/>
+                                <w:szCs w:val="16"/>
+                              </w:rPr>
+                              <w:t xml:space="preserve"> (</w:t>
+                            </w:r>
+                            <w:proofErr w:type="gramEnd"/>
+                            <w:r>
+                              <w:rPr>
+                                <w:sz w:val="16"/>
+                                <w:szCs w:val="16"/>
+                              </w:rPr>
+                              <w:t xml:space="preserve">map) =&gt; </w:t>
+                            </w:r>
+                            <w:proofErr w:type="spellStart"/>
+                            <w:proofErr w:type="gramStart"/>
+                            <w:r>
+                              <w:rPr>
+                                <w:sz w:val="16"/>
+                                <w:szCs w:val="16"/>
+                              </w:rPr>
+                              <w:t>map.countState</w:t>
+                            </w:r>
+                            <w:proofErr w:type="spellEnd"/>
+                            <w:proofErr w:type="gramEnd"/>
+                            <w:r>
+                              <w:rPr>
+                                <w:sz w:val="16"/>
+                                <w:szCs w:val="16"/>
+                              </w:rPr>
+                              <w:t>)</w:t>
+                            </w:r>
+                          </w:p>
+                        </w:txbxContent>
+                      </wps:txbx>
+                      <wps:bodyPr rot="0" spcFirstLastPara="0" vertOverflow="overflow" horzOverflow="overflow" vert="horz" wrap="square" lIns="91440" tIns="45720" rIns="91440" bIns="45720" numCol="1" spcCol="0" rtlCol="0" fromWordArt="0" anchor="t" anchorCtr="0" forceAA="0" compatLnSpc="1">
+                        <a:prstTxWarp prst="textNoShape">
+                          <a:avLst/>
+                        </a:prstTxWarp>
+                        <a:noAutofit/>
+                      </wps:bodyPr>
+                    </wps:wsp>
+                  </a:graphicData>
+                </a:graphic>
+                <wp14:sizeRelH relativeFrom="margin">
+                  <wp14:pctWidth>0</wp14:pctWidth>
+                </wp14:sizeRelH>
+              </wp:anchor>
+            </w:drawing>
+          </mc:Choice>
+          <mc:Fallback>
+            <w:pict>
+              <v:shapetype w14:anchorId="48CD5F70" id="_x0000_t202" coordsize="21600,21600" o:spt="202" path="m,l,21600r21600,l21600,xe">
+                <v:stroke joinstyle="miter"/>
+                <v:path gradientshapeok="t" o:connecttype="rect"/>
+              </v:shapetype>
+              <v:shape id="Text Box 36" o:spid="_x0000_s1026" type="#_x0000_t202" style="position:absolute;margin-left:-32.65pt;margin-top:-16.65pt;width:262pt;height:21pt;z-index:251706368;visibility:visible;mso-wrap-style:square;mso-width-percent:0;mso-wrap-distance-left:9pt;mso-wrap-distance-top:0;mso-wrap-distance-right:9pt;mso-wrap-distance-bottom:0;mso-position-horizontal:absolute;mso-position-horizontal-relative:text;mso-position-vertical:absolute;mso-position-vertical-relative:text;mso-width-percent:0;mso-width-relative:margin;v-text-anchor:top" o:gfxdata="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" fillcolor="white [3201]" strokeweight=".5pt">
+                <v:textbox>
+                  <w:txbxContent>
+                    <w:p>
+                      <w:pPr>
+                        <w:rPr>
+                          <w:sz w:val="16"/>
+                          <w:szCs w:val="16"/>
+                        </w:rPr>
+                      </w:pPr>
+                      <w:proofErr w:type="spellStart"/>
+                      <w:r>
+                        <w:rPr>
+                          <w:sz w:val="16"/>
+                          <w:szCs w:val="16"/>
+                        </w:rPr>
+                        <w:t>const</w:t>
+                      </w:r>
+                      <w:proofErr w:type="spellEnd"/>
+                      <w:r>
+                        <w:rPr>
+                          <w:sz w:val="16"/>
+                          <w:szCs w:val="16"/>
+                        </w:rPr>
+                        <w:t xml:space="preserve"> {count}= </w:t>
+                      </w:r>
+                      <w:proofErr w:type="spellStart"/>
+                      <w:proofErr w:type="gramStart"/>
+                      <w:r>
+                        <w:rPr>
+                          <w:sz w:val="16"/>
+                          <w:szCs w:val="16"/>
+                        </w:rPr>
+                        <w:t>use</w:t>
+                      </w:r>
+                      <w:r>
+                        <w:rPr>
+                          <w:sz w:val="16"/>
+                          <w:szCs w:val="16"/>
+                        </w:rPr>
+                        <w:t>Typed</w:t>
+                      </w:r>
+                      <w:r>
+                        <w:rPr>
+                          <w:sz w:val="16"/>
+                          <w:szCs w:val="16"/>
+                        </w:rPr>
+                        <w:t>Selector</w:t>
+                      </w:r>
+                      <w:proofErr w:type="spellEnd"/>
+                      <w:r>
+                        <w:rPr>
+                          <w:sz w:val="16"/>
+                          <w:szCs w:val="16"/>
+                        </w:rPr>
+                        <w:t>(</w:t>
+                      </w:r>
+                      <w:r>
+                        <w:rPr>
+                          <w:sz w:val="16"/>
+                          <w:szCs w:val="16"/>
+                        </w:rPr>
+                        <w:t xml:space="preserve"> (</w:t>
+                      </w:r>
+                      <w:proofErr w:type="gramEnd"/>
+                      <w:r>
+                        <w:rPr>
+                          <w:sz w:val="16"/>
+                          <w:szCs w:val="16"/>
+                        </w:rPr>
+                        <w:t xml:space="preserve">map) =&gt; </w:t>
+                      </w:r>
+                      <w:proofErr w:type="spellStart"/>
+                      <w:proofErr w:type="gramStart"/>
+                      <w:r>
+                        <w:rPr>
+                          <w:sz w:val="16"/>
+                          <w:szCs w:val="16"/>
+                        </w:rPr>
+                        <w:t>map.countState</w:t>
+                      </w:r>
+                      <w:proofErr w:type="spellEnd"/>
+                      <w:proofErr w:type="gramEnd"/>
+                      <w:r>
+                        <w:rPr>
+                          <w:sz w:val="16"/>
+                          <w:szCs w:val="16"/>
+                        </w:rPr>
+                        <w:t>)</w:t>
+                      </w:r>
+                    </w:p>
+                  </w:txbxContent>
+                </v:textbox>
+              </v:shape>
+            </w:pict>
+          </mc:Fallback>
+        </mc:AlternateContent>
+      </w:r>
+      <w:r>
+        <w:rPr>
+          <w:noProof/>
+        </w:rPr>
+        <mc:AlternateContent>
+          <mc:Choice Requires="wps">
+            <w:drawing>
+              <wp:anchor distT="0" distB="0" distL="114300" distR="114300" simplePos="0" relativeHeight="251705344" behindDoc="0" locked="0" layoutInCell="1" allowOverlap="1" wp14:anchorId="518F1843" wp14:editId="32640E79">
+                <wp:simplePos x="0" y="0"/>
+                <wp:positionH relativeFrom="column">
+                  <wp:posOffset>2815167</wp:posOffset>
+                </wp:positionH>
+                <wp:positionV relativeFrom="paragraph">
+                  <wp:posOffset>1206923</wp:posOffset>
+                </wp:positionV>
+                <wp:extent cx="1316355" cy="355600"/>
+                <wp:effectExtent l="0" t="0" r="17145" b="25400"/>
+                <wp:wrapNone/>
+                <wp:docPr id="2074357313" name="Text Box 35"/>
+                <wp:cNvGraphicFramePr/>
+                <a:graphic xmlns:a="http://schemas.openxmlformats.org/drawingml/2006/main">
+                  <a:graphicData uri="http://schemas.microsoft.com/office/word/2010/wordprocessingShape">
+                    <wps:wsp>
+                      <wps:cNvSpPr txBox="1"/>
+                      <wps:spPr>
+                        <a:xfrm>
+                          <a:off x="0" y="0"/>
+                          <a:ext cx="1316355" cy="355600"/>
+                        </a:xfrm>
+                        <a:prstGeom prst="rect">
+                          <a:avLst/>
+                        </a:prstGeom>
+                        <a:solidFill>
+                          <a:schemeClr val="lt1"/>
+                        </a:solidFill>
+                        <a:ln w="6350">
+                          <a:solidFill>
+                            <a:prstClr val="black"/>
+                          </a:solidFill>
+                        </a:ln>
+                      </wps:spPr>
+                      <wps:txbx>
+                        <w:txbxContent>
+                          <w:p>
+                            <w:pPr>
+                              <w:rPr>
+                                <w:sz w:val="20"/>
+                                <w:szCs w:val="20"/>
+                              </w:rPr>
+                            </w:pPr>
+                            <w:proofErr w:type="spellStart"/>
+                            <w:proofErr w:type="gramStart"/>
+                            <w:r>
+                              <w:rPr>
+                                <w:sz w:val="20"/>
+                                <w:szCs w:val="20"/>
+                              </w:rPr>
+                              <w:t>combineRed</w:t>
+                            </w:r>
+                            <w:r>
+                              <w:rPr>
+                                <w:sz w:val="20"/>
+                                <w:szCs w:val="20"/>
+                              </w:rPr>
+                              <w:t>u</w:t>
+                            </w:r>
+                            <w:r>
+                              <w:rPr>
+                                <w:sz w:val="20"/>
+                                <w:szCs w:val="20"/>
+                              </w:rPr>
+                              <w:t>cers</w:t>
+                            </w:r>
+                            <w:proofErr w:type="spellEnd"/>
+                            <w:r>
+                              <w:rPr>
+                                <w:sz w:val="20"/>
+                                <w:szCs w:val="20"/>
+                              </w:rPr>
+                              <w:t>(</w:t>
+                            </w:r>
+                            <w:proofErr w:type="gramEnd"/>
+                            <w:r>
+                              <w:rPr>
+                                <w:sz w:val="20"/>
+                                <w:szCs w:val="20"/>
+                              </w:rPr>
+                              <w:t>)</w:t>
+                            </w:r>
+                          </w:p>
+                        </w:txbxContent>
+                      </wps:txbx>
+                      <wps:bodyPr rot="0" spcFirstLastPara="0" vertOverflow="overflow" horzOverflow="overflow" vert="horz" wrap="square" lIns="91440" tIns="45720" rIns="91440" bIns="45720" numCol="1" spcCol="0" rtlCol="0" fromWordArt="0" anchor="t" anchorCtr="0" forceAA="0" compatLnSpc="1">
+                        <a:prstTxWarp prst="textNoShape">
+                          <a:avLst/>
+                        </a:prstTxWarp>
+                        <a:noAutofit/>
+                      </wps:bodyPr>
+                    </wps:wsp>
+                  </a:graphicData>
+                </a:graphic>
+                <wp14:sizeRelH relativeFrom="margin">
+                  <wp14:pctWidth>0</wp14:pctWidth>
+                </wp14:sizeRelH>
+              </wp:anchor>
+            </w:drawing>
+          </mc:Choice>
+          <mc:Fallback>
+            <w:pict>
+              <v:shape w14:anchorId="518F1843" id="Text Box 35" o:spid="_x0000_s1027" type="#_x0000_t202" style="position:absolute;margin-left:221.65pt;margin-top:95.05pt;width:103.65pt;height:28pt;z-index:251705344;visibility:visible;mso-wrap-style:square;mso-width-percent:0;mso-wrap-distance-left:9pt;mso-wrap-distance-top:0;mso-wrap-distance-right:9pt;mso-wrap-distance-bottom:0;mso-position-horizontal:absolute;mso-position-horizontal-relative:text;mso-position-vertical:absolute;mso-position-vertical-relative:text;mso-width-percent:0;mso-width-relative:margin;v-text-anchor:top" o:gfxdata="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" fillcolor="white [3201]" strokeweight=".5pt">
+                <v:textbox>
+                  <w:txbxContent>
+                    <w:p>
+                      <w:pPr>
+                        <w:rPr>
+                          <w:sz w:val="20"/>
+                          <w:szCs w:val="20"/>
+                        </w:rPr>
+                      </w:pPr>
+                      <w:proofErr w:type="spellStart"/>
+                      <w:proofErr w:type="gramStart"/>
+                      <w:r>
+                        <w:rPr>
+                          <w:sz w:val="20"/>
+                          <w:szCs w:val="20"/>
+                        </w:rPr>
+                        <w:t>combineRed</w:t>
+                      </w:r>
+                      <w:r>
+                        <w:rPr>
+                          <w:sz w:val="20"/>
+                          <w:szCs w:val="20"/>
+                        </w:rPr>
+                        <w:t>u</w:t>
+                      </w:r>
+                      <w:r>
+                        <w:rPr>
+                          <w:sz w:val="20"/>
+                          <w:szCs w:val="20"/>
+                        </w:rPr>
+                        <w:t>cers</w:t>
+                      </w:r>
+                      <w:proofErr w:type="spellEnd"/>
+                      <w:r>
+                        <w:rPr>
+                          <w:sz w:val="20"/>
+                          <w:szCs w:val="20"/>
+                        </w:rPr>
+                        <w:t>(</w:t>
+                      </w:r>
+                      <w:proofErr w:type="gramEnd"/>
+                      <w:r>
+                        <w:rPr>
+                          <w:sz w:val="20"/>
+                          <w:szCs w:val="20"/>
+                        </w:rPr>
+                        <w:t>)</w:t>
+                      </w:r>
+                    </w:p>
+                  </w:txbxContent>
+                </v:textbox>
+              </v:shape>
+            </w:pict>
+          </mc:Fallback>
+        </mc:AlternateContent>
+      </w:r>
+      <w:r>
+        <w:rPr>
+          <w:noProof/>
+        </w:rPr>
+        <mc:AlternateContent>
+          <mc:Choice Requires="wps">
+            <w:drawing>
+              <wp:anchor distT="0" distB="0" distL="114300" distR="114300" simplePos="0" relativeHeight="251709440" behindDoc="0" locked="0" layoutInCell="1" allowOverlap="1" wp14:anchorId="547B38E3" wp14:editId="242DA450">
+                <wp:simplePos x="0" y="0"/>
+                <wp:positionH relativeFrom="column">
+                  <wp:posOffset>-427567</wp:posOffset>
+                </wp:positionH>
+                <wp:positionV relativeFrom="paragraph">
+                  <wp:posOffset>-563033</wp:posOffset>
+                </wp:positionV>
+                <wp:extent cx="3365500" cy="347133"/>
+                <wp:effectExtent l="0" t="0" r="25400" b="15240"/>
+                <wp:wrapNone/>
+                <wp:docPr id="1692028097" name="Text Box 36"/>
+                <wp:cNvGraphicFramePr/>
+                <a:graphic xmlns:a="http://schemas.openxmlformats.org/drawingml/2006/main">
+                  <a:graphicData uri="http://schemas.microsoft.com/office/word/2010/wordprocessingShape">
+                    <wps:wsp>
+                      <wps:cNvSpPr txBox="1"/>
+                      <wps:spPr>
+                        <a:xfrm>
+                          <a:off x="0" y="0"/>
+                          <a:ext cx="3365500" cy="347133"/>
+                        </a:xfrm>
+                        <a:prstGeom prst="rect">
+                          <a:avLst/>
+                        </a:prstGeom>
+                        <a:solidFill>
+                          <a:schemeClr val="lt1"/>
+                        </a:solidFill>
+                        <a:ln w="6350">
+                          <a:solidFill>
+                            <a:prstClr val="black"/>
+                          </a:solidFill>
+                        </a:ln>
+                      </wps:spPr>
+                      <wps:txbx>
+                        <w:txbxContent>
+                          <w:p>
+                            <w:pPr>
+                              <w:rPr>
+                                <w:sz w:val="16"/>
+                                <w:szCs w:val="16"/>
+                              </w:rPr>
+                            </w:pPr>
+                            <w:proofErr w:type="spellStart"/>
+                            <w:r>
+                              <w:rPr>
+                                <w:sz w:val="16"/>
+                                <w:szCs w:val="16"/>
+                              </w:rPr>
+                              <w:t>const</w:t>
+                            </w:r>
+                            <w:proofErr w:type="spellEnd"/>
+                            <w:r>
+                              <w:rPr>
+                                <w:sz w:val="16"/>
+                                <w:szCs w:val="16"/>
+                              </w:rPr>
+                              <w:t xml:space="preserve"> </w:t>
+                            </w:r>
+                            <w:proofErr w:type="spellStart"/>
+                            <w:r>
+                              <w:rPr>
+                                <w:sz w:val="16"/>
+                                <w:szCs w:val="16"/>
+                              </w:rPr>
+                              <w:t>useTypedSelector</w:t>
+                            </w:r>
+                            <w:proofErr w:type="spellEnd"/>
+                            <w:r>
+                              <w:rPr>
+                                <w:sz w:val="16"/>
+                                <w:szCs w:val="16"/>
+                              </w:rPr>
+                              <w:t xml:space="preserve"> = </w:t>
+                            </w:r>
+                            <w:proofErr w:type="spellStart"/>
+                            <w:r>
+                              <w:rPr>
+                                <w:sz w:val="16"/>
+                                <w:szCs w:val="16"/>
+                              </w:rPr>
+                              <w:t>u</w:t>
+                            </w:r>
+                            <w:r>
+                              <w:rPr>
+                                <w:sz w:val="16"/>
+                                <w:szCs w:val="16"/>
+                              </w:rPr>
+                              <w:t>seSelector</w:t>
+                            </w:r>
+                            <w:r>
+                              <w:rPr>
+                                <w:sz w:val="16"/>
+                                <w:szCs w:val="16"/>
+                              </w:rPr>
+                              <w:t>.withTypes</w:t>
+                            </w:r>
+                            <w:proofErr w:type="spellEnd"/>
+                            <w:r>
+                              <w:rPr>
+                                <w:sz w:val="16"/>
+                                <w:szCs w:val="16"/>
+                              </w:rPr>
+                              <w:t>&lt;</w:t>
+                            </w:r>
+                            <w:proofErr w:type="spellStart"/>
+                            <w:r>
+                              <w:rPr>
+                                <w:sz w:val="16"/>
+                                <w:szCs w:val="16"/>
+                              </w:rPr>
+                              <w:t>StoreStateMapType</w:t>
+                            </w:r>
+                            <w:proofErr w:type="spellEnd"/>
+                            <w:proofErr w:type="gramStart"/>
+                            <w:r>
+                              <w:rPr>
+                                <w:sz w:val="16"/>
+                                <w:szCs w:val="16"/>
+                              </w:rPr>
+                              <w:t>&gt;(</w:t>
+                            </w:r>
+                            <w:proofErr w:type="gramEnd"/>
+                            <w:r>
+                              <w:rPr>
+                                <w:sz w:val="16"/>
+                                <w:szCs w:val="16"/>
+                              </w:rPr>
+                              <w:t>)</w:t>
+                            </w:r>
+                          </w:p>
+                        </w:txbxContent>
+                      </wps:txbx>
+                      <wps:bodyPr rot="0" spcFirstLastPara="0" vertOverflow="overflow" horzOverflow="overflow" vert="horz" wrap="square" lIns="91440" tIns="45720" rIns="91440" bIns="45720" numCol="1" spcCol="0" rtlCol="0" fromWordArt="0" anchor="t" anchorCtr="0" forceAA="0" compatLnSpc="1">
+                        <a:prstTxWarp prst="textNoShape">
+                          <a:avLst/>
+                        </a:prstTxWarp>
+                        <a:noAutofit/>
+                      </wps:bodyPr>
+                    </wps:wsp>
+                  </a:graphicData>
+                </a:graphic>
+                <wp14:sizeRelH relativeFrom="margin">
+                  <wp14:pctWidth>0</wp14:pctWidth>
+                </wp14:sizeRelH>
+                <wp14:sizeRelV relativeFrom="margin">
+                  <wp14:pctHeight>0</wp14:pctHeight>
+                </wp14:sizeRelV>
+              </wp:anchor>
+            </w:drawing>
+          </mc:Choice>
+          <mc:Fallback>
+            <w:pict>
+              <v:shape w14:anchorId="547B38E3" id="_x0000_s1028" type="#_x0000_t202" style="position:absolute;margin-left:-33.65pt;margin-top:-44.35pt;width:265pt;height:27.35pt;z-index:251709440;visibility:visible;mso-wrap-style:square;mso-width-percent:0;mso-height-percent:0;mso-wrap-distance-left:9pt;mso-wrap-distance-top:0;mso-wrap-distance-right:9pt;mso-wrap-distance-bottom:0;mso-position-horizontal:absolute;mso-position-horizontal-relative:text;mso-position-vertical:absolute;mso-position-vertical-relative:text;mso-width-percent:0;mso-height-percent:0;mso-width-relative:margin;mso-height-relative:margin;v-text-anchor:top" o:gfxdata="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" fillcolor="white [3201]" strokeweight=".5pt">
+                <v:textbox>
+                  <w:txbxContent>
+                    <w:p>
+                      <w:pPr>
+                        <w:rPr>
+                          <w:sz w:val="16"/>
+                          <w:szCs w:val="16"/>
+                        </w:rPr>
+                      </w:pPr>
+                      <w:proofErr w:type="spellStart"/>
+                      <w:r>
+                        <w:rPr>
+                          <w:sz w:val="16"/>
+                          <w:szCs w:val="16"/>
+                        </w:rPr>
+                        <w:t>const</w:t>
+                      </w:r>
+                      <w:proofErr w:type="spellEnd"/>
+                      <w:r>
+                        <w:rPr>
+                          <w:sz w:val="16"/>
+                          <w:szCs w:val="16"/>
+                        </w:rPr>
+                        <w:t xml:space="preserve"> </w:t>
+                      </w:r>
+                      <w:proofErr w:type="spellStart"/>
+                      <w:r>
+                        <w:rPr>
+                          <w:sz w:val="16"/>
+                          <w:szCs w:val="16"/>
+                        </w:rPr>
+                        <w:t>useTypedSelector</w:t>
+                      </w:r>
+                      <w:proofErr w:type="spellEnd"/>
+                      <w:r>
+                        <w:rPr>
+                          <w:sz w:val="16"/>
+                          <w:szCs w:val="16"/>
+                        </w:rPr>
+                        <w:t xml:space="preserve"> = </w:t>
+                      </w:r>
+                      <w:proofErr w:type="spellStart"/>
+                      <w:r>
+                        <w:rPr>
+                          <w:sz w:val="16"/>
+                          <w:szCs w:val="16"/>
+                        </w:rPr>
+                        <w:t>u</w:t>
+                      </w:r>
+                      <w:r>
+                        <w:rPr>
+                          <w:sz w:val="16"/>
+                          <w:szCs w:val="16"/>
+                        </w:rPr>
+                        <w:t>seSelector</w:t>
+                      </w:r>
+                      <w:r>
+                        <w:rPr>
+                          <w:sz w:val="16"/>
+                          <w:szCs w:val="16"/>
+                        </w:rPr>
+                        <w:t>.withTypes</w:t>
+                      </w:r>
+                      <w:proofErr w:type="spellEnd"/>
+                      <w:r>
+                        <w:rPr>
+                          <w:sz w:val="16"/>
+                          <w:szCs w:val="16"/>
+                        </w:rPr>
+                        <w:t>&lt;</w:t>
+                      </w:r>
+                      <w:proofErr w:type="spellStart"/>
+                      <w:r>
+                        <w:rPr>
+                          <w:sz w:val="16"/>
+                          <w:szCs w:val="16"/>
+                        </w:rPr>
+                        <w:t>StoreStateMapType</w:t>
+                      </w:r>
+                      <w:proofErr w:type="spellEnd"/>
+                      <w:proofErr w:type="gramStart"/>
+                      <w:r>
+                        <w:rPr>
+                          <w:sz w:val="16"/>
+                          <w:szCs w:val="16"/>
+                        </w:rPr>
+                        <w:t>&gt;(</w:t>
+                      </w:r>
+                      <w:proofErr w:type="gramEnd"/>
+                      <w:r>
+                        <w:rPr>
+                          <w:sz w:val="16"/>
+                          <w:szCs w:val="16"/>
+                        </w:rPr>
+                        <w:t>)</w:t>
+                      </w:r>
+                    </w:p>
+                  </w:txbxContent>
+                </v:textbox>
+              </v:shape>
+            </w:pict>
+          </mc:Fallback>
+        </mc:AlternateContent>
+      </w:r>
+      <w:r>
+        <w:rPr>
+          <w:noProof/>
+        </w:rPr>
+        <mc:AlternateContent>
+          <mc:Choice Requires="wps">
+            <w:drawing>
+              <wp:anchor distT="0" distB="0" distL="114300" distR="114300" simplePos="0" relativeHeight="251707392" behindDoc="0" locked="0" layoutInCell="1" allowOverlap="1" wp14:anchorId="681A13EC" wp14:editId="7EDBE271">
+                <wp:simplePos x="0" y="0"/>
+                <wp:positionH relativeFrom="column">
+                  <wp:posOffset>529167</wp:posOffset>
+                </wp:positionH>
+                <wp:positionV relativeFrom="paragraph">
+                  <wp:posOffset>4233</wp:posOffset>
+                </wp:positionV>
+                <wp:extent cx="347133" cy="575734"/>
+                <wp:effectExtent l="0" t="0" r="72390" b="53340"/>
+                <wp:wrapNone/>
+                <wp:docPr id="60482994" name="Straight Arrow Connector 37"/>
+                <wp:cNvGraphicFramePr/>
+                <a:graphic xmlns:a="http://schemas.openxmlformats.org/drawingml/2006/main">
+                  <a:graphicData uri="http://schemas.microsoft.com/office/word/2010/wordprocessingShape">
+                    <wps:wsp>
+                      <wps:cNvCnPr/>
+                      <wps:spPr>
+                        <a:xfrm>
+                          <a:off x="0" y="0"/>
+                          <a:ext cx="347133" cy="575734"/>
+                        </a:xfrm>
+                        <a:prstGeom prst="straightConnector1">
+                          <a:avLst/>
+                        </a:prstGeom>
+                        <a:ln>
+                          <a:tailEnd type="triangle"/>
+                        </a:ln>
+                      </wps:spPr>
+                      <wps:style>
+                        <a:lnRef idx="1">
+                          <a:schemeClr val="accent6"/>
+                        </a:lnRef>
+                        <a:fillRef idx="0">
+                          <a:schemeClr val="accent6"/>
+                        </a:fillRef>
+                        <a:effectRef idx="0">
+                          <a:schemeClr val="accent6"/>
+                        </a:effectRef>
+                        <a:fontRef idx="minor">
+                          <a:schemeClr val="tx1"/>
+                        </a:fontRef>
+                      </wps:style>
+                      <wps:bodyPr/>
+                    </wps:wsp>
+                  </a:graphicData>
+                </a:graphic>
+              </wp:anchor>
+            </w:drawing>
+          </mc:Choice>
+          <mc:Fallback>
+            <w:pict>
+              <v:shapetype w14:anchorId="2C787AE1" id="_x0000_t32" coordsize="21600,21600" o:spt="32" o:oned="t" path="m,l21600,21600e" filled="f">
+                <v:path arrowok="t" fillok="f" o:connecttype="none"/>
+                <o:lock v:ext="edit" shapetype="t"/>
+              </v:shapetype>
+              <v:shape id="Straight Arrow Connector 37" o:spid="_x0000_s1026" type="#_x0000_t32" style="position:absolute;margin-left:41.65pt;margin-top:.35pt;width:27.35pt;height:45.35pt;z-index:251707392;visibility:visible;mso-wrap-style:square;mso-wrap-distance-left:9pt;mso-wrap-distance-top:0;mso-wrap-distance-right:9pt;mso-wrap-distance-bottom:0;mso-position-horizontal:absolute;mso-position-horizontal-relative:text;mso-position-vertical:absolute;mso-position-vertical-relative:text" o:gfxdata="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" strokecolor="#4ea72e [3209]" strokeweight="1pt">
+                <v:stroke endarrow="block" joinstyle="miter"/>
+              </v:shape>
+            </w:pict>
+          </mc:Fallback>
+        </mc:AlternateContent>
+      </w:r>
+      <w:r>
+        <w:rPr>
+          <w:noProof/>
+        </w:rPr>
+        <mc:AlternateContent>
+          <mc:Choice Requires="wps">
+            <w:drawing>
+              <wp:anchor distT="0" distB="0" distL="114300" distR="114300" simplePos="0" relativeHeight="251689984" behindDoc="0" locked="0" layoutInCell="1" allowOverlap="1" wp14:anchorId="098DDCBD" wp14:editId="36578A1A">
+                <wp:simplePos x="0" y="0"/>
+                <wp:positionH relativeFrom="column">
+                  <wp:posOffset>867833</wp:posOffset>
+                </wp:positionH>
+                <wp:positionV relativeFrom="paragraph">
+                  <wp:posOffset>414867</wp:posOffset>
+                </wp:positionV>
+                <wp:extent cx="1384300" cy="295910"/>
+                <wp:effectExtent l="0" t="0" r="25400" b="27940"/>
+                <wp:wrapNone/>
+                <wp:docPr id="701534954" name="Text Box 22"/>
+                <wp:cNvGraphicFramePr/>
+                <a:graphic xmlns:a="http://schemas.openxmlformats.org/drawingml/2006/main">
+                  <a:graphicData uri="http://schemas.microsoft.com/office/word/2010/wordprocessingShape">
+                    <wps:wsp>
+                      <wps:cNvSpPr txBox="1"/>
+                      <wps:spPr>
+                        <a:xfrm>
+                          <a:off x="0" y="0"/>
+                          <a:ext cx="1384300" cy="295910"/>
+                        </a:xfrm>
+                        <a:prstGeom prst="rect">
+                          <a:avLst/>
+                        </a:prstGeom>
+                        <a:solidFill>
+                          <a:schemeClr val="accent1">
+                            <a:lumMod val="60000"/>
+                            <a:lumOff val="40000"/>
+                          </a:schemeClr>
+                        </a:solidFill>
+                        <a:ln w="6350">
+                          <a:solidFill>
+                            <a:prstClr val="black"/>
+                          </a:solidFill>
+                        </a:ln>
+                      </wps:spPr>
+                      <wps:txbx>
+                        <w:txbxContent>
+                          <w:p>
+                            <w:pPr>
+                              <w:rPr>
+                                <w:sz w:val="16"/>
+                                <w:szCs w:val="16"/>
+                              </w:rPr>
+                            </w:pPr>
+                            <w:r>
+                              <w:rPr>
+                                <w:sz w:val="16"/>
+                                <w:szCs w:val="16"/>
+                              </w:rPr>
+                              <w:t xml:space="preserve">Subscribed to </w:t>
+                            </w:r>
+                            <w:proofErr w:type="spellStart"/>
+                            <w:r>
+                              <w:rPr>
+                                <w:sz w:val="16"/>
+                                <w:szCs w:val="16"/>
+                              </w:rPr>
+                              <w:t>countState</w:t>
+                            </w:r>
+                            <w:proofErr w:type="spellEnd"/>
+                          </w:p>
+                        </w:txbxContent>
+                      </wps:txbx>
+                      <wps:bodyPr rot="0" spcFirstLastPara="0" vertOverflow="overflow" horzOverflow="overflow" vert="horz" wrap="square" lIns="91440" tIns="45720" rIns="91440" bIns="45720" numCol="1" spcCol="0" rtlCol="0" fromWordArt="0" anchor="t" anchorCtr="0" forceAA="0" compatLnSpc="1">
+                        <a:prstTxWarp prst="textNoShape">
+                          <a:avLst/>
+                        </a:prstTxWarp>
+                        <a:noAutofit/>
+                      </wps:bodyPr>
+                    </wps:wsp>
+                  </a:graphicData>
+                </a:graphic>
+                <wp14:sizeRelH relativeFrom="margin">
+                  <wp14:pctWidth>0</wp14:pctWidth>
+                </wp14:sizeRelH>
+              </wp:anchor>
+            </w:drawing>
+          </mc:Choice>
+          <mc:Fallback>
+            <w:pict>
+              <v:shape w14:anchorId="098DDCBD" id="Text Box 22" o:spid="_x0000_s1029" type="#_x0000_t202" style="position:absolute;margin-left:68.35pt;margin-top:32.65pt;width:109pt;height:23.3pt;z-index:251689984;visibility:visible;mso-wrap-style:square;mso-width-percent:0;mso-wrap-distance-left:9pt;mso-wrap-distance-top:0;mso-wrap-distance-right:9pt;mso-wrap-distance-bottom:0;mso-position-horizontal:absolute;mso-position-horizontal-relative:text;mso-position-vertical:absolute;mso-position-vertical-relative:text;mso-width-percent:0;mso-width-relative:margin;v-text-anchor:top" o:gfxdata="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" fillcolor="#45b0e1 [1940]" strokeweight=".5pt">
+                <v:textbox>
+                  <w:txbxContent>
+                    <w:p>
+                      <w:pPr>
+                        <w:rPr>
+                          <w:sz w:val="16"/>
+                          <w:szCs w:val="16"/>
+                        </w:rPr>
+                      </w:pPr>
+                      <w:r>
+                        <w:rPr>
+                          <w:sz w:val="16"/>
+                          <w:szCs w:val="16"/>
+                        </w:rPr>
+                        <w:t xml:space="preserve">Subscribed to </w:t>
+                      </w:r>
+                      <w:proofErr w:type="spellStart"/>
+                      <w:r>
+                        <w:rPr>
+                          <w:sz w:val="16"/>
+                          <w:szCs w:val="16"/>
+                        </w:rPr>
+                        <w:t>countState</w:t>
+                      </w:r>
+                      <w:proofErr w:type="spellEnd"/>
+                    </w:p>
+                  </w:txbxContent>
+                </v:textbox>
+              </v:shape>
+            </w:pict>
+          </mc:Fallback>
+        </mc:AlternateContent>
+      </w:r>
+      <w:r>
+        <w:rPr>
+          <w:noProof/>
+        </w:rPr>
+        <mc:AlternateContent>
+          <mc:Choice Requires="wps">
+            <w:drawing>
+              <wp:anchor distT="0" distB="0" distL="114300" distR="114300" simplePos="0" relativeHeight="251672576" behindDoc="0" locked="0" layoutInCell="1" allowOverlap="1" wp14:anchorId="54AED70A" wp14:editId="714BF360">
+                <wp:simplePos x="0" y="0"/>
+                <wp:positionH relativeFrom="column">
+                  <wp:posOffset>3128433</wp:posOffset>
+                </wp:positionH>
+                <wp:positionV relativeFrom="paragraph">
+                  <wp:posOffset>-2329</wp:posOffset>
+                </wp:positionV>
+                <wp:extent cx="732155" cy="1213061"/>
+                <wp:effectExtent l="0" t="0" r="10795" b="25400"/>
+                <wp:wrapNone/>
+                <wp:docPr id="2133154812" name="Rectangle: Rounded Corners 7"/>
                 <wp:cNvGraphicFramePr/>
                 <a:graphic xmlns:a="http://schemas.openxmlformats.org/drawingml/2006/main">
                   <a:graphicData uri="http://schemas.microsoft.com/office/word/2010/wordprocessingShape">
@@ -30,11 +906,17 @@
                       <wps:spPr>
                         <a:xfrm>
                           <a:off x="0" y="0"/>
-                          <a:ext cx="4182110" cy="2489200"/>
+                          <a:ext cx="732155" cy="1213061"/>
                         </a:xfrm>
-                        <a:prstGeom prst="rect">
+                        <a:prstGeom prst="roundRect">
                           <a:avLst/>
                         </a:prstGeom>
+                        <a:solidFill>
+                          <a:schemeClr val="accent3">
+                            <a:lumMod val="20000"/>
+                            <a:lumOff val="80000"/>
+                          </a:schemeClr>
+                        </a:solidFill>
                       </wps:spPr>
                       <wps:style>
                         <a:lnRef idx="2">
@@ -52,6 +934,82 @@
                           <a:schemeClr val="lt1"/>
                         </a:fontRef>
                       </wps:style>
+                      <wps:txbx>
+                        <w:txbxContent>
+                          <w:p>
+                            <w:pPr>
+                              <w:jc w:val="center"/>
+                              <w:rPr>
+                                <w:color w:val="000000" w:themeColor="text1"/>
+                                <w14:shadow w14:blurRad="38100" w14:dist="19050" w14:dir="2700000" w14:sx="100000" w14:sy="100000" w14:kx="0" w14:ky="0" w14:algn="tl">
+                                  <w14:schemeClr w14:val="dk1">
+                                    <w14:alpha w14:val="60000"/>
+                                  </w14:schemeClr>
+                                </w14:shadow>
+                                <w14:textOutline w14:w="0" w14:cap="flat" w14:cmpd="sng" w14:algn="ctr">
+                                  <w14:noFill/>
+                                  <w14:prstDash w14:val="solid"/>
+                                  <w14:round/>
+                                </w14:textOutline>
+                              </w:rPr>
+                            </w:pPr>
+                            <w:proofErr w:type="spellStart"/>
+                            <w:r>
+                              <w:rPr>
+                                <w:color w:val="000000" w:themeColor="text1"/>
+                                <w14:shadow w14:blurRad="38100" w14:dist="19050" w14:dir="2700000" w14:sx="100000" w14:sy="100000" w14:kx="0" w14:ky="0" w14:algn="tl">
+                                  <w14:schemeClr w14:val="dk1">
+                                    <w14:alpha w14:val="60000"/>
+                                  </w14:schemeClr>
+                                </w14:shadow>
+                                <w14:textOutline w14:w="0" w14:cap="flat" w14:cmpd="sng" w14:algn="ctr">
+                                  <w14:noFill/>
+                                  <w14:prstDash w14:val="solid"/>
+                                  <w14:round/>
+                                </w14:textOutline>
+                              </w:rPr>
+                              <w:t>countState</w:t>
+                            </w:r>
+                            <w:proofErr w:type="spellEnd"/>
+                          </w:p>
+                          <w:p>
+                            <w:pPr>
+                              <w:jc w:val="center"/>
+                              <w:rPr>
+                                <w:color w:val="000000" w:themeColor="text1"/>
+                                <w14:shadow w14:blurRad="38100" w14:dist="19050" w14:dir="2700000" w14:sx="100000" w14:sy="100000" w14:kx="0" w14:ky="0" w14:algn="tl">
+                                  <w14:schemeClr w14:val="dk1">
+                                    <w14:alpha w14:val="60000"/>
+                                  </w14:schemeClr>
+                                </w14:shadow>
+                                <w14:textOutline w14:w="0" w14:cap="flat" w14:cmpd="sng" w14:algn="ctr">
+                                  <w14:noFill/>
+                                  <w14:prstDash w14:val="solid"/>
+                                  <w14:round/>
+                                </w14:textOutline>
+                              </w:rPr>
+                            </w:pPr>
+                            <w:proofErr w:type="spellStart"/>
+                            <w:r>
+                              <w:rPr>
+                                <w:color w:val="000000" w:themeColor="text1"/>
+                                <w14:shadow w14:blurRad="38100" w14:dist="19050" w14:dir="2700000" w14:sx="100000" w14:sy="100000" w14:kx="0" w14:ky="0" w14:algn="tl">
+                                  <w14:schemeClr w14:val="dk1">
+                                    <w14:alpha w14:val="60000"/>
+                                  </w14:schemeClr>
+                                </w14:shadow>
+                                <w14:textOutline w14:w="0" w14:cap="flat" w14:cmpd="sng" w14:algn="ctr">
+                                  <w14:noFill/>
+                                  <w14:prstDash w14:val="solid"/>
+                                  <w14:round/>
+                                </w14:textOutline>
+                              </w:rPr>
+                              <w:t>nameState</w:t>
+                            </w:r>
+                            <w:proofErr w:type="spellEnd"/>
+                          </w:p>
+                        </w:txbxContent>
+                      </wps:txbx>
                       <wps:bodyPr rot="0" spcFirstLastPara="0" vertOverflow="overflow" horzOverflow="overflow" vert="horz" wrap="square" lIns="91440" tIns="45720" rIns="91440" bIns="45720" numCol="1" spcCol="0" rtlCol="0" fromWordArt="0" anchor="ctr" anchorCtr="0" forceAA="0" compatLnSpc="1">
                         <a:prstTxWarp prst="textNoShape">
                           <a:avLst/>
@@ -61,9 +1019,6 @@
                     </wps:wsp>
                   </a:graphicData>
                 </a:graphic>
-                <wp14:sizeRelH relativeFrom="margin">
-                  <wp14:pctWidth>0</wp14:pctWidth>
-                </wp14:sizeRelH>
                 <wp14:sizeRelV relativeFrom="margin">
                   <wp14:pctHeight>0</wp14:pctHeight>
                 </wp14:sizeRelV>
@@ -72,7 +1027,85 @@
           </mc:Choice>
           <mc:Fallback>
             <w:pict>
-              <v:rect w14:anchorId="279505EB" id="Rectangle 1" o:spid="_x0000_s1026" style="position:absolute;margin-left:181.3pt;margin-top:-46pt;width:329.3pt;height:196pt;z-index:251659264;visibility:visible;mso-wrap-style:square;mso-width-percent:0;mso-height-percent:0;mso-wrap-distance-left:9pt;mso-wrap-distance-top:0;mso-wrap-distance-right:9pt;mso-wrap-distance-bottom:0;mso-position-horizontal:absolute;mso-position-horizontal-relative:text;mso-position-vertical:absolute;mso-position-vertical-relative:text;mso-width-percent:0;mso-height-percent:0;mso-width-relative:margin;mso-height-relative:margin;v-text-anchor:middle" o:gfxdata="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" fillcolor="#156082 [3204]" strokecolor="#030e13 [484]" strokeweight="1.5pt"/>
+              <v:roundrect w14:anchorId="54AED70A" id="Rectangle: Rounded Corners 7" o:spid="_x0000_s1030" style="position:absolute;margin-left:246.35pt;margin-top:-.2pt;width:57.65pt;height:95.5pt;z-index:251672576;visibility:visible;mso-wrap-style:square;mso-height-percent:0;mso-wrap-distance-left:9pt;mso-wrap-distance-top:0;mso-wrap-distance-right:9pt;mso-wrap-distance-bottom:0;mso-position-horizontal:absolute;mso-position-horizontal-relative:text;mso-position-vertical:absolute;mso-position-vertical-relative:text;mso-height-percent:0;mso-height-relative:margin;v-text-anchor:middle" arcsize="10923f" o:gfxdata="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" fillcolor="#c1f0c7 [662]" strokecolor="#030e13 [484]" strokeweight="1.5pt">
+                <v:stroke joinstyle="miter"/>
+                <v:textbox>
+                  <w:txbxContent>
+                    <w:p>
+                      <w:pPr>
+                        <w:jc w:val="center"/>
+                        <w:rPr>
+                          <w:color w:val="000000" w:themeColor="text1"/>
+                          <w14:shadow w14:blurRad="38100" w14:dist="19050" w14:dir="2700000" w14:sx="100000" w14:sy="100000" w14:kx="0" w14:ky="0" w14:algn="tl">
+                            <w14:schemeClr w14:val="dk1">
+                              <w14:alpha w14:val="60000"/>
+                            </w14:schemeClr>
+                          </w14:shadow>
+                          <w14:textOutline w14:w="0" w14:cap="flat" w14:cmpd="sng" w14:algn="ctr">
+                            <w14:noFill/>
+                            <w14:prstDash w14:val="solid"/>
+                            <w14:round/>
+                          </w14:textOutline>
+                        </w:rPr>
+                      </w:pPr>
+                      <w:proofErr w:type="spellStart"/>
+                      <w:r>
+                        <w:rPr>
+                          <w:color w:val="000000" w:themeColor="text1"/>
+                          <w14:shadow w14:blurRad="38100" w14:dist="19050" w14:dir="2700000" w14:sx="100000" w14:sy="100000" w14:kx="0" w14:ky="0" w14:algn="tl">
+                            <w14:schemeClr w14:val="dk1">
+                              <w14:alpha w14:val="60000"/>
+                            </w14:schemeClr>
+                          </w14:shadow>
+                          <w14:textOutline w14:w="0" w14:cap="flat" w14:cmpd="sng" w14:algn="ctr">
+                            <w14:noFill/>
+                            <w14:prstDash w14:val="solid"/>
+                            <w14:round/>
+                          </w14:textOutline>
+                        </w:rPr>
+                        <w:t>countState</w:t>
+                      </w:r>
+                      <w:proofErr w:type="spellEnd"/>
+                    </w:p>
+                    <w:p>
+                      <w:pPr>
+                        <w:jc w:val="center"/>
+                        <w:rPr>
+                          <w:color w:val="000000" w:themeColor="text1"/>
+                          <w14:shadow w14:blurRad="38100" w14:dist="19050" w14:dir="2700000" w14:sx="100000" w14:sy="100000" w14:kx="0" w14:ky="0" w14:algn="tl">
+                            <w14:schemeClr w14:val="dk1">
+                              <w14:alpha w14:val="60000"/>
+                            </w14:schemeClr>
+                          </w14:shadow>
+                          <w14:textOutline w14:w="0" w14:cap="flat" w14:cmpd="sng" w14:algn="ctr">
+                            <w14:noFill/>
+                            <w14:prstDash w14:val="solid"/>
+                            <w14:round/>
+                          </w14:textOutline>
+                        </w:rPr>
+                      </w:pPr>
+                      <w:proofErr w:type="spellStart"/>
+                      <w:r>
+                        <w:rPr>
+                          <w:color w:val="000000" w:themeColor="text1"/>
+                          <w14:shadow w14:blurRad="38100" w14:dist="19050" w14:dir="2700000" w14:sx="100000" w14:sy="100000" w14:kx="0" w14:ky="0" w14:algn="tl">
+                            <w14:schemeClr w14:val="dk1">
+                              <w14:alpha w14:val="60000"/>
+                            </w14:schemeClr>
+                          </w14:shadow>
+                          <w14:textOutline w14:w="0" w14:cap="flat" w14:cmpd="sng" w14:algn="ctr">
+                            <w14:noFill/>
+                            <w14:prstDash w14:val="solid"/>
+                            <w14:round/>
+                          </w14:textOutline>
+                        </w:rPr>
+                        <w:t>nameState</w:t>
+                      </w:r>
+                      <w:proofErr w:type="spellEnd"/>
+                    </w:p>
+                  </w:txbxContent>
+                </v:textbox>
+              </v:roundrect>
             </w:pict>
           </mc:Fallback>
         </mc:AlternateContent>
@@ -84,193 +1117,18 @@
         <mc:AlternateContent>
           <mc:Choice Requires="wps">
             <w:drawing>
-              <wp:anchor distT="0" distB="0" distL="114300" distR="114300" simplePos="0" relativeHeight="251696128" behindDoc="0" locked="0" layoutInCell="1" allowOverlap="1" wp14:anchorId="7603A7D4" wp14:editId="1133A2F8">
+              <wp:anchor distT="0" distB="0" distL="114300" distR="114300" simplePos="0" relativeHeight="251674624" behindDoc="0" locked="0" layoutInCell="1" allowOverlap="1" wp14:anchorId="6BA3E7BF" wp14:editId="56E0A3A4">
                 <wp:simplePos x="0" y="0"/>
                 <wp:positionH relativeFrom="column">
-                  <wp:posOffset>1104900</wp:posOffset>
+                  <wp:posOffset>3712634</wp:posOffset>
                 </wp:positionH>
                 <wp:positionV relativeFrom="paragraph">
-                  <wp:posOffset>1507067</wp:posOffset>
+                  <wp:posOffset>925831</wp:posOffset>
                 </wp:positionV>
-                <wp:extent cx="914400" cy="850900"/>
-                <wp:effectExtent l="0" t="0" r="19050" b="25400"/>
+                <wp:extent cx="165100" cy="45719"/>
+                <wp:effectExtent l="0" t="57150" r="25400" b="50165"/>
                 <wp:wrapNone/>
-                <wp:docPr id="595554245" name="Text Box 30"/>
-                <wp:cNvGraphicFramePr/>
-                <a:graphic xmlns:a="http://schemas.openxmlformats.org/drawingml/2006/main">
-                  <a:graphicData uri="http://schemas.microsoft.com/office/word/2010/wordprocessingShape">
-                    <wps:wsp>
-                      <wps:cNvSpPr txBox="1"/>
-                      <wps:spPr>
-                        <a:xfrm>
-                          <a:off x="0" y="0"/>
-                          <a:ext cx="914400" cy="850900"/>
-                        </a:xfrm>
-                        <a:prstGeom prst="rect">
-                          <a:avLst/>
-                        </a:prstGeom>
-                        <a:solidFill>
-                          <a:schemeClr val="lt1"/>
-                        </a:solidFill>
-                        <a:ln w="6350">
-                          <a:solidFill>
-                            <a:prstClr val="black"/>
-                          </a:solidFill>
-                        </a:ln>
-                      </wps:spPr>
-                      <wps:txbx>
-                        <w:txbxContent>
-                          <w:p>
-                            <w:pPr>
-                              <w:rPr>
-                                <w:sz w:val="16"/>
-                                <w:szCs w:val="16"/>
-                              </w:rPr>
-                            </w:pPr>
-                            <w:r>
-                              <w:rPr>
-                                <w:sz w:val="16"/>
-                                <w:szCs w:val="16"/>
-                              </w:rPr>
-                              <w:t>&lt;Provider store={AppStore}&gt;</w:t>
-                            </w:r>
-                            <w:r>
-                              <w:rPr>
-                                <w:sz w:val="16"/>
-                                <w:szCs w:val="16"/>
-                              </w:rPr>
-                              <w:t xml:space="preserve"> &lt;App/&gt;</w:t>
-                            </w:r>
-                          </w:p>
-                          <w:p>
-                            <w:pPr>
-                              <w:rPr>
-                                <w:sz w:val="16"/>
-                                <w:szCs w:val="16"/>
-                              </w:rPr>
-                            </w:pPr>
-                            <w:r>
-                              <w:rPr>
-                                <w:sz w:val="16"/>
-                                <w:szCs w:val="16"/>
-                              </w:rPr>
-                              <w:t>&lt;/</w:t>
-                            </w:r>
-                            <w:r>
-                              <w:rPr>
-                                <w:sz w:val="16"/>
-                                <w:szCs w:val="16"/>
-                              </w:rPr>
-                              <w:t>Provider</w:t>
-                            </w:r>
-                            <w:r>
-                              <w:rPr>
-                                <w:sz w:val="16"/>
-                                <w:szCs w:val="16"/>
-                              </w:rPr>
-                              <w:t>&gt;</w:t>
-                            </w:r>
-                          </w:p>
-                        </w:txbxContent>
-                      </wps:txbx>
-                      <wps:bodyPr rot="0" spcFirstLastPara="0" vertOverflow="overflow" horzOverflow="overflow" vert="horz" wrap="square" lIns="91440" tIns="45720" rIns="91440" bIns="45720" numCol="1" spcCol="0" rtlCol="0" fromWordArt="0" anchor="t" anchorCtr="0" forceAA="0" compatLnSpc="1">
-                        <a:prstTxWarp prst="textNoShape">
-                          <a:avLst/>
-                        </a:prstTxWarp>
-                        <a:noAutofit/>
-                      </wps:bodyPr>
-                    </wps:wsp>
-                  </a:graphicData>
-                </a:graphic>
-              </wp:anchor>
-            </w:drawing>
-          </mc:Choice>
-          <mc:Fallback>
-            <w:pict>
-              <v:shapetype w14:anchorId="7603A7D4" id="_x0000_t202" coordsize="21600,21600" o:spt="202" path="m,l,21600r21600,l21600,xe">
-                <v:stroke joinstyle="miter"/>
-                <v:path gradientshapeok="t" o:connecttype="rect"/>
-              </v:shapetype>
-              <v:shape id="Text Box 30" o:spid="_x0000_s1026" type="#_x0000_t202" style="position:absolute;margin-left:87pt;margin-top:118.65pt;width:1in;height:67pt;z-index:251696128;visibility:visible;mso-wrap-style:square;mso-wrap-distance-left:9pt;mso-wrap-distance-top:0;mso-wrap-distance-right:9pt;mso-wrap-distance-bottom:0;mso-position-horizontal:absolute;mso-position-horizontal-relative:text;mso-position-vertical:absolute;mso-position-vertical-relative:text;v-text-anchor:top" o:gfxdata="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" fillcolor="white [3201]" strokeweight=".5pt">
-                <v:textbox>
-                  <w:txbxContent>
-                    <w:p>
-                      <w:pPr>
-                        <w:rPr>
-                          <w:sz w:val="16"/>
-                          <w:szCs w:val="16"/>
-                        </w:rPr>
-                      </w:pPr>
-                      <w:r>
-                        <w:rPr>
-                          <w:sz w:val="16"/>
-                          <w:szCs w:val="16"/>
-                        </w:rPr>
-                        <w:t>&lt;Provider store={AppStore}&gt;</w:t>
-                      </w:r>
-                      <w:r>
-                        <w:rPr>
-                          <w:sz w:val="16"/>
-                          <w:szCs w:val="16"/>
-                        </w:rPr>
-                        <w:t xml:space="preserve"> &lt;App/&gt;</w:t>
-                      </w:r>
-                    </w:p>
-                    <w:p>
-                      <w:pPr>
-                        <w:rPr>
-                          <w:sz w:val="16"/>
-                          <w:szCs w:val="16"/>
-                        </w:rPr>
-                      </w:pPr>
-                      <w:r>
-                        <w:rPr>
-                          <w:sz w:val="16"/>
-                          <w:szCs w:val="16"/>
-                        </w:rPr>
-                        <w:t>&lt;/</w:t>
-                      </w:r>
-                      <w:r>
-                        <w:rPr>
-                          <w:sz w:val="16"/>
-                          <w:szCs w:val="16"/>
-                        </w:rPr>
-                        <w:t>Provider</w:t>
-                      </w:r>
-                      <w:r>
-                        <w:rPr>
-                          <w:sz w:val="16"/>
-                          <w:szCs w:val="16"/>
-                        </w:rPr>
-                        <w:t>&gt;</w:t>
-                      </w:r>
-                    </w:p>
-                  </w:txbxContent>
-                </v:textbox>
-              </v:shape>
-            </w:pict>
-          </mc:Fallback>
-        </mc:AlternateContent>
-      </w:r>
-      <w:r>
-        <w:rPr>
-          <w:noProof/>
-        </w:rPr>
-        <mc:AlternateContent>
-          <mc:Choice Requires="wps">
-            <w:drawing>
-              <wp:anchor distT="0" distB="0" distL="114300" distR="114300" simplePos="0" relativeHeight="251673600" behindDoc="0" locked="0" layoutInCell="1" allowOverlap="1" wp14:anchorId="1E80DB4B" wp14:editId="0D8A64B1">
-                <wp:simplePos x="0" y="0"/>
-                <wp:positionH relativeFrom="column">
-                  <wp:posOffset>3738033</wp:posOffset>
-                </wp:positionH>
-                <wp:positionV relativeFrom="paragraph">
-                  <wp:posOffset>4233</wp:posOffset>
-                </wp:positionV>
-                <wp:extent cx="338667" cy="317500"/>
-                <wp:effectExtent l="0" t="38100" r="61595" b="25400"/>
-                <wp:wrapNone/>
-                <wp:docPr id="1850052347" name="Straight Arrow Connector 8"/>
+                <wp:docPr id="1543425407" name="Straight Arrow Connector 9"/>
                 <wp:cNvGraphicFramePr/>
                 <a:graphic xmlns:a="http://schemas.openxmlformats.org/drawingml/2006/main">
                   <a:graphicData uri="http://schemas.microsoft.com/office/word/2010/wordprocessingShape">
@@ -279,7 +1137,7 @@
                       <wps:spPr>
                         <a:xfrm flipV="1">
                           <a:off x="0" y="0"/>
-                          <a:ext cx="338667" cy="317500"/>
+                          <a:ext cx="165100" cy="45719"/>
                         </a:xfrm>
                         <a:prstGeom prst="straightConnector1">
                           <a:avLst/>
@@ -317,12 +1175,648 @@
           </mc:Choice>
           <mc:Fallback>
             <w:pict>
-              <v:shapetype w14:anchorId="0651FF0D" id="_x0000_t32" coordsize="21600,21600" o:spt="32" o:oned="t" path="m,l21600,21600e" filled="f">
-                <v:path arrowok="t" fillok="f" o:connecttype="none"/>
-                <o:lock v:ext="edit" shapetype="t"/>
-              </v:shapetype>
-              <v:shape id="Straight Arrow Connector 8" o:spid="_x0000_s1026" type="#_x0000_t32" style="position:absolute;margin-left:294.35pt;margin-top:.35pt;width:26.65pt;height:25pt;flip:y;z-index:251673600;visibility:visible;mso-wrap-style:square;mso-width-percent:0;mso-height-percent:0;mso-wrap-distance-left:9pt;mso-wrap-distance-top:0;mso-wrap-distance-right:9pt;mso-wrap-distance-bottom:0;mso-position-horizontal:absolute;mso-position-horizontal-relative:text;mso-position-vertical:absolute;mso-position-vertical-relative:text;mso-width-percent:0;mso-height-percent:0;mso-width-relative:margin;mso-height-relative:margin" o:gfxdata="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" strokecolor="black [3200]" strokeweight="1.5pt">
+              <v:shape w14:anchorId="6174AC28" id="Straight Arrow Connector 9" o:spid="_x0000_s1026" type="#_x0000_t32" style="position:absolute;margin-left:292.35pt;margin-top:72.9pt;width:13pt;height:3.6pt;flip:y;z-index:251674624;visibility:visible;mso-wrap-style:square;mso-width-percent:0;mso-height-percent:0;mso-wrap-distance-left:9pt;mso-wrap-distance-top:0;mso-wrap-distance-right:9pt;mso-wrap-distance-bottom:0;mso-position-horizontal:absolute;mso-position-horizontal-relative:text;mso-position-vertical:absolute;mso-position-vertical-relative:text;mso-width-percent:0;mso-height-percent:0;mso-width-relative:margin;mso-height-relative:margin" o:gfxdata="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" strokecolor="black [3200]" strokeweight="1.5pt">
                 <v:stroke endarrow="block" joinstyle="miter"/>
+              </v:shape>
+            </w:pict>
+          </mc:Fallback>
+        </mc:AlternateContent>
+      </w:r>
+      <w:r>
+        <w:rPr>
+          <w:noProof/>
+        </w:rPr>
+        <mc:AlternateContent>
+          <mc:Choice Requires="wps">
+            <w:drawing>
+              <wp:anchor distT="0" distB="0" distL="114300" distR="114300" simplePos="0" relativeHeight="251673600" behindDoc="0" locked="0" layoutInCell="1" allowOverlap="1" wp14:anchorId="1E80DB4B" wp14:editId="452841DC">
+                <wp:simplePos x="0" y="0"/>
+                <wp:positionH relativeFrom="column">
+                  <wp:posOffset>3738034</wp:posOffset>
+                </wp:positionH>
+                <wp:positionV relativeFrom="paragraph">
+                  <wp:posOffset>232833</wp:posOffset>
+                </wp:positionV>
+                <wp:extent cx="152400" cy="88900"/>
+                <wp:effectExtent l="0" t="38100" r="57150" b="25400"/>
+                <wp:wrapNone/>
+                <wp:docPr id="1850052347" name="Straight Arrow Connector 8"/>
+                <wp:cNvGraphicFramePr/>
+                <a:graphic xmlns:a="http://schemas.openxmlformats.org/drawingml/2006/main">
+                  <a:graphicData uri="http://schemas.microsoft.com/office/word/2010/wordprocessingShape">
+                    <wps:wsp>
+                      <wps:cNvCnPr/>
+                      <wps:spPr>
+                        <a:xfrm flipV="1">
+                          <a:off x="0" y="0"/>
+                          <a:ext cx="152400" cy="88900"/>
+                        </a:xfrm>
+                        <a:prstGeom prst="straightConnector1">
+                          <a:avLst/>
+                        </a:prstGeom>
+                        <a:ln>
+                          <a:tailEnd type="triangle"/>
+                        </a:ln>
+                      </wps:spPr>
+                      <wps:style>
+                        <a:lnRef idx="2">
+                          <a:schemeClr val="dk1"/>
+                        </a:lnRef>
+                        <a:fillRef idx="0">
+                          <a:schemeClr val="dk1"/>
+                        </a:fillRef>
+                        <a:effectRef idx="1">
+                          <a:schemeClr val="dk1"/>
+                        </a:effectRef>
+                        <a:fontRef idx="minor">
+                          <a:schemeClr val="tx1"/>
+                        </a:fontRef>
+                      </wps:style>
+                      <wps:bodyPr/>
+                    </wps:wsp>
+                  </a:graphicData>
+                </a:graphic>
+                <wp14:sizeRelH relativeFrom="margin">
+                  <wp14:pctWidth>0</wp14:pctWidth>
+                </wp14:sizeRelH>
+                <wp14:sizeRelV relativeFrom="margin">
+                  <wp14:pctHeight>0</wp14:pctHeight>
+                </wp14:sizeRelV>
+              </wp:anchor>
+            </w:drawing>
+          </mc:Choice>
+          <mc:Fallback>
+            <w:pict>
+              <v:shape w14:anchorId="3322B371" id="Straight Arrow Connector 8" o:spid="_x0000_s1026" type="#_x0000_t32" style="position:absolute;margin-left:294.35pt;margin-top:18.35pt;width:12pt;height:7pt;flip:y;z-index:251673600;visibility:visible;mso-wrap-style:square;mso-width-percent:0;mso-height-percent:0;mso-wrap-distance-left:9pt;mso-wrap-distance-top:0;mso-wrap-distance-right:9pt;mso-wrap-distance-bottom:0;mso-position-horizontal:absolute;mso-position-horizontal-relative:text;mso-position-vertical:absolute;mso-position-vertical-relative:text;mso-width-percent:0;mso-height-percent:0;mso-width-relative:margin;mso-height-relative:margin" o:gfxdata="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" strokecolor="black [3200]" strokeweight="1.5pt">
+                <v:stroke endarrow="block" joinstyle="miter"/>
+              </v:shape>
+            </w:pict>
+          </mc:Fallback>
+        </mc:AlternateContent>
+      </w:r>
+      <w:r>
+        <w:rPr>
+          <w:noProof/>
+        </w:rPr>
+        <mc:AlternateContent>
+          <mc:Choice Requires="wps">
+            <w:drawing>
+              <wp:anchor distT="0" distB="0" distL="114300" distR="114300" simplePos="0" relativeHeight="251704320" behindDoc="0" locked="0" layoutInCell="1" allowOverlap="1" wp14:anchorId="39FF1F86" wp14:editId="25A93A51">
+                <wp:simplePos x="0" y="0"/>
+                <wp:positionH relativeFrom="column">
+                  <wp:posOffset>4686300</wp:posOffset>
+                </wp:positionH>
+                <wp:positionV relativeFrom="paragraph">
+                  <wp:posOffset>262255</wp:posOffset>
+                </wp:positionV>
+                <wp:extent cx="1037167" cy="279400"/>
+                <wp:effectExtent l="0" t="0" r="10795" b="25400"/>
+                <wp:wrapNone/>
+                <wp:docPr id="594959712" name="Text Box 34"/>
+                <wp:cNvGraphicFramePr/>
+                <a:graphic xmlns:a="http://schemas.openxmlformats.org/drawingml/2006/main">
+                  <a:graphicData uri="http://schemas.microsoft.com/office/word/2010/wordprocessingShape">
+                    <wps:wsp>
+                      <wps:cNvSpPr txBox="1"/>
+                      <wps:spPr>
+                        <a:xfrm>
+                          <a:off x="0" y="0"/>
+                          <a:ext cx="1037167" cy="279400"/>
+                        </a:xfrm>
+                        <a:prstGeom prst="rect">
+                          <a:avLst/>
+                        </a:prstGeom>
+                        <a:solidFill>
+                          <a:schemeClr val="lt1"/>
+                        </a:solidFill>
+                        <a:ln w="6350">
+                          <a:solidFill>
+                            <a:prstClr val="black"/>
+                          </a:solidFill>
+                        </a:ln>
+                      </wps:spPr>
+                      <wps:txbx>
+                        <w:txbxContent>
+                          <w:p>
+                            <w:proofErr w:type="spellStart"/>
+                            <w:r>
+                              <w:t>name</w:t>
+                            </w:r>
+                            <w:r>
+                              <w:t>Slice</w:t>
+                            </w:r>
+                            <w:proofErr w:type="spellEnd"/>
+                          </w:p>
+                        </w:txbxContent>
+                      </wps:txbx>
+                      <wps:bodyPr rot="0" spcFirstLastPara="0" vertOverflow="overflow" horzOverflow="overflow" vert="horz" wrap="square" lIns="91440" tIns="45720" rIns="91440" bIns="45720" numCol="1" spcCol="0" rtlCol="0" fromWordArt="0" anchor="t" anchorCtr="0" forceAA="0" compatLnSpc="1">
+                        <a:prstTxWarp prst="textNoShape">
+                          <a:avLst/>
+                        </a:prstTxWarp>
+                        <a:noAutofit/>
+                      </wps:bodyPr>
+                    </wps:wsp>
+                  </a:graphicData>
+                </a:graphic>
+              </wp:anchor>
+            </w:drawing>
+          </mc:Choice>
+          <mc:Fallback>
+            <w:pict>
+              <v:shape w14:anchorId="39FF1F86" id="Text Box 34" o:spid="_x0000_s1031" type="#_x0000_t202" style="position:absolute;margin-left:369pt;margin-top:20.65pt;width:81.65pt;height:22pt;z-index:251704320;visibility:visible;mso-wrap-style:square;mso-wrap-distance-left:9pt;mso-wrap-distance-top:0;mso-wrap-distance-right:9pt;mso-wrap-distance-bottom:0;mso-position-horizontal:absolute;mso-position-horizontal-relative:text;mso-position-vertical:absolute;mso-position-vertical-relative:text;v-text-anchor:top" o:gfxdata="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" fillcolor="white [3201]" strokeweight=".5pt">
+                <v:textbox>
+                  <w:txbxContent>
+                    <w:p>
+                      <w:proofErr w:type="spellStart"/>
+                      <w:r>
+                        <w:t>name</w:t>
+                      </w:r>
+                      <w:r>
+                        <w:t>Slice</w:t>
+                      </w:r>
+                      <w:proofErr w:type="spellEnd"/>
+                    </w:p>
+                  </w:txbxContent>
+                </v:textbox>
+              </v:shape>
+            </w:pict>
+          </mc:Fallback>
+        </mc:AlternateContent>
+      </w:r>
+      <w:r>
+        <w:rPr>
+          <w:noProof/>
+        </w:rPr>
+        <mc:AlternateContent>
+          <mc:Choice Requires="wps">
+            <w:drawing>
+              <wp:anchor distT="0" distB="0" distL="114300" distR="114300" simplePos="0" relativeHeight="251702272" behindDoc="0" locked="0" layoutInCell="1" allowOverlap="1" wp14:anchorId="4721373A" wp14:editId="3E8D4BDF">
+                <wp:simplePos x="0" y="0"/>
+                <wp:positionH relativeFrom="column">
+                  <wp:posOffset>4648200</wp:posOffset>
+                </wp:positionH>
+                <wp:positionV relativeFrom="paragraph">
+                  <wp:posOffset>-554567</wp:posOffset>
+                </wp:positionV>
+                <wp:extent cx="1037167" cy="279400"/>
+                <wp:effectExtent l="0" t="0" r="10795" b="25400"/>
+                <wp:wrapNone/>
+                <wp:docPr id="448636344" name="Text Box 34"/>
+                <wp:cNvGraphicFramePr/>
+                <a:graphic xmlns:a="http://schemas.openxmlformats.org/drawingml/2006/main">
+                  <a:graphicData uri="http://schemas.microsoft.com/office/word/2010/wordprocessingShape">
+                    <wps:wsp>
+                      <wps:cNvSpPr txBox="1"/>
+                      <wps:spPr>
+                        <a:xfrm>
+                          <a:off x="0" y="0"/>
+                          <a:ext cx="1037167" cy="279400"/>
+                        </a:xfrm>
+                        <a:prstGeom prst="rect">
+                          <a:avLst/>
+                        </a:prstGeom>
+                        <a:solidFill>
+                          <a:schemeClr val="lt1"/>
+                        </a:solidFill>
+                        <a:ln w="6350">
+                          <a:solidFill>
+                            <a:prstClr val="black"/>
+                          </a:solidFill>
+                        </a:ln>
+                      </wps:spPr>
+                      <wps:txbx>
+                        <w:txbxContent>
+                          <w:p>
+                            <w:proofErr w:type="spellStart"/>
+                            <w:r>
+                              <w:t>countSlice</w:t>
+                            </w:r>
+                            <w:proofErr w:type="spellEnd"/>
+                          </w:p>
+                        </w:txbxContent>
+                      </wps:txbx>
+                      <wps:bodyPr rot="0" spcFirstLastPara="0" vertOverflow="overflow" horzOverflow="overflow" vert="horz" wrap="square" lIns="91440" tIns="45720" rIns="91440" bIns="45720" numCol="1" spcCol="0" rtlCol="0" fromWordArt="0" anchor="t" anchorCtr="0" forceAA="0" compatLnSpc="1">
+                        <a:prstTxWarp prst="textNoShape">
+                          <a:avLst/>
+                        </a:prstTxWarp>
+                        <a:noAutofit/>
+                      </wps:bodyPr>
+                    </wps:wsp>
+                  </a:graphicData>
+                </a:graphic>
+              </wp:anchor>
+            </w:drawing>
+          </mc:Choice>
+          <mc:Fallback>
+            <w:pict>
+              <v:shape w14:anchorId="4721373A" id="_x0000_s1032" type="#_x0000_t202" style="position:absolute;margin-left:366pt;margin-top:-43.65pt;width:81.65pt;height:22pt;z-index:251702272;visibility:visible;mso-wrap-style:square;mso-wrap-distance-left:9pt;mso-wrap-distance-top:0;mso-wrap-distance-right:9pt;mso-wrap-distance-bottom:0;mso-position-horizontal:absolute;mso-position-horizontal-relative:text;mso-position-vertical:absolute;mso-position-vertical-relative:text;v-text-anchor:top" o:gfxdata="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" fillcolor="white [3201]" strokeweight=".5pt">
+                <v:textbox>
+                  <w:txbxContent>
+                    <w:p>
+                      <w:proofErr w:type="spellStart"/>
+                      <w:r>
+                        <w:t>countSlice</w:t>
+                      </w:r>
+                      <w:proofErr w:type="spellEnd"/>
+                    </w:p>
+                  </w:txbxContent>
+                </v:textbox>
+              </v:shape>
+            </w:pict>
+          </mc:Fallback>
+        </mc:AlternateContent>
+      </w:r>
+      <w:r>
+        <w:rPr>
+          <w:noProof/>
+        </w:rPr>
+        <mc:AlternateContent>
+          <mc:Choice Requires="wps">
+            <w:drawing>
+              <wp:anchor distT="0" distB="0" distL="114300" distR="114300" simplePos="0" relativeHeight="251699200" behindDoc="0" locked="0" layoutInCell="1" allowOverlap="1" wp14:anchorId="6EA43919" wp14:editId="32A1B81D">
+                <wp:simplePos x="0" y="0"/>
+                <wp:positionH relativeFrom="column">
+                  <wp:posOffset>3890010</wp:posOffset>
+                </wp:positionH>
+                <wp:positionV relativeFrom="paragraph">
+                  <wp:posOffset>397510</wp:posOffset>
+                </wp:positionV>
+                <wp:extent cx="2599267" cy="774700"/>
+                <wp:effectExtent l="0" t="0" r="10795" b="25400"/>
+                <wp:wrapNone/>
+                <wp:docPr id="264707969" name="Rectangle 31"/>
+                <wp:cNvGraphicFramePr/>
+                <a:graphic xmlns:a="http://schemas.openxmlformats.org/drawingml/2006/main">
+                  <a:graphicData uri="http://schemas.microsoft.com/office/word/2010/wordprocessingShape">
+                    <wps:wsp>
+                      <wps:cNvSpPr/>
+                      <wps:spPr>
+                        <a:xfrm>
+                          <a:off x="0" y="0"/>
+                          <a:ext cx="2599267" cy="774700"/>
+                        </a:xfrm>
+                        <a:prstGeom prst="rect">
+                          <a:avLst/>
+                        </a:prstGeom>
+                        <a:noFill/>
+                        <a:ln>
+                          <a:solidFill>
+                            <a:srgbClr val="FFC000"/>
+                          </a:solidFill>
+                        </a:ln>
+                      </wps:spPr>
+                      <wps:style>
+                        <a:lnRef idx="2">
+                          <a:schemeClr val="dk1">
+                            <a:shade val="15000"/>
+                          </a:schemeClr>
+                        </a:lnRef>
+                        <a:fillRef idx="1">
+                          <a:schemeClr val="dk1"/>
+                        </a:fillRef>
+                        <a:effectRef idx="0">
+                          <a:schemeClr val="dk1"/>
+                        </a:effectRef>
+                        <a:fontRef idx="minor">
+                          <a:schemeClr val="lt1"/>
+                        </a:fontRef>
+                      </wps:style>
+                      <wps:bodyPr rot="0" spcFirstLastPara="0" vertOverflow="overflow" horzOverflow="overflow" vert="horz" wrap="square" lIns="91440" tIns="45720" rIns="91440" bIns="45720" numCol="1" spcCol="0" rtlCol="0" fromWordArt="0" anchor="ctr" anchorCtr="0" forceAA="0" compatLnSpc="1">
+                        <a:prstTxWarp prst="textNoShape">
+                          <a:avLst/>
+                        </a:prstTxWarp>
+                        <a:noAutofit/>
+                      </wps:bodyPr>
+                    </wps:wsp>
+                  </a:graphicData>
+                </a:graphic>
+                <wp14:sizeRelV relativeFrom="margin">
+                  <wp14:pctHeight>0</wp14:pctHeight>
+                </wp14:sizeRelV>
+              </wp:anchor>
+            </w:drawing>
+          </mc:Choice>
+          <mc:Fallback>
+            <w:pict>
+              <v:rect w14:anchorId="4A5FF2CA" id="Rectangle 31" o:spid="_x0000_s1026" style="position:absolute;margin-left:306.3pt;margin-top:31.3pt;width:204.65pt;height:61pt;z-index:251699200;visibility:visible;mso-wrap-style:square;mso-height-percent:0;mso-wrap-distance-left:9pt;mso-wrap-distance-top:0;mso-wrap-distance-right:9pt;mso-wrap-distance-bottom:0;mso-position-horizontal:absolute;mso-position-horizontal-relative:text;mso-position-vertical:absolute;mso-position-vertical-relative:text;mso-height-percent:0;mso-height-relative:margin;v-text-anchor:middle" o:gfxdata="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" filled="f" strokecolor="#ffc000" strokeweight="1.5pt"/>
+            </w:pict>
+          </mc:Fallback>
+        </mc:AlternateContent>
+      </w:r>
+      <w:r>
+        <w:rPr>
+          <w:noProof/>
+        </w:rPr>
+        <mc:AlternateContent>
+          <mc:Choice Requires="wps">
+            <w:drawing>
+              <wp:anchor distT="0" distB="0" distL="114300" distR="114300" simplePos="0" relativeHeight="251697152" behindDoc="0" locked="0" layoutInCell="1" allowOverlap="1" wp14:anchorId="477E72E7" wp14:editId="3723EC9D">
+                <wp:simplePos x="0" y="0"/>
+                <wp:positionH relativeFrom="column">
+                  <wp:posOffset>3890433</wp:posOffset>
+                </wp:positionH>
+                <wp:positionV relativeFrom="paragraph">
+                  <wp:posOffset>-461433</wp:posOffset>
+                </wp:positionV>
+                <wp:extent cx="2599267" cy="846666"/>
+                <wp:effectExtent l="0" t="0" r="10795" b="10795"/>
+                <wp:wrapNone/>
+                <wp:docPr id="1660840430" name="Rectangle 31"/>
+                <wp:cNvGraphicFramePr/>
+                <a:graphic xmlns:a="http://schemas.openxmlformats.org/drawingml/2006/main">
+                  <a:graphicData uri="http://schemas.microsoft.com/office/word/2010/wordprocessingShape">
+                    <wps:wsp>
+                      <wps:cNvSpPr/>
+                      <wps:spPr>
+                        <a:xfrm>
+                          <a:off x="0" y="0"/>
+                          <a:ext cx="2599267" cy="846666"/>
+                        </a:xfrm>
+                        <a:prstGeom prst="rect">
+                          <a:avLst/>
+                        </a:prstGeom>
+                        <a:noFill/>
+                        <a:ln>
+                          <a:solidFill>
+                            <a:srgbClr val="FFC000"/>
+                          </a:solidFill>
+                        </a:ln>
+                      </wps:spPr>
+                      <wps:style>
+                        <a:lnRef idx="2">
+                          <a:schemeClr val="dk1">
+                            <a:shade val="15000"/>
+                          </a:schemeClr>
+                        </a:lnRef>
+                        <a:fillRef idx="1">
+                          <a:schemeClr val="dk1"/>
+                        </a:fillRef>
+                        <a:effectRef idx="0">
+                          <a:schemeClr val="dk1"/>
+                        </a:effectRef>
+                        <a:fontRef idx="minor">
+                          <a:schemeClr val="lt1"/>
+                        </a:fontRef>
+                      </wps:style>
+                      <wps:bodyPr rot="0" spcFirstLastPara="0" vertOverflow="overflow" horzOverflow="overflow" vert="horz" wrap="square" lIns="91440" tIns="45720" rIns="91440" bIns="45720" numCol="1" spcCol="0" rtlCol="0" fromWordArt="0" anchor="ctr" anchorCtr="0" forceAA="0" compatLnSpc="1">
+                        <a:prstTxWarp prst="textNoShape">
+                          <a:avLst/>
+                        </a:prstTxWarp>
+                        <a:noAutofit/>
+                      </wps:bodyPr>
+                    </wps:wsp>
+                  </a:graphicData>
+                </a:graphic>
+              </wp:anchor>
+            </w:drawing>
+          </mc:Choice>
+          <mc:Fallback>
+            <w:pict>
+              <v:rect w14:anchorId="7BB888D0" id="Rectangle 31" o:spid="_x0000_s1026" style="position:absolute;margin-left:306.35pt;margin-top:-36.35pt;width:204.65pt;height:66.65pt;z-index:251697152;visibility:visible;mso-wrap-style:square;mso-wrap-distance-left:9pt;mso-wrap-distance-top:0;mso-wrap-distance-right:9pt;mso-wrap-distance-bottom:0;mso-position-horizontal:absolute;mso-position-horizontal-relative:text;mso-position-vertical:absolute;mso-position-vertical-relative:text;v-text-anchor:middle" o:gfxdata="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" filled="f" strokecolor="#ffc000" strokeweight="1.5pt"/>
+            </w:pict>
+          </mc:Fallback>
+        </mc:AlternateContent>
+      </w:r>
+      <w:r>
+        <w:rPr>
+          <w:noProof/>
+        </w:rPr>
+        <mc:AlternateContent>
+          <mc:Choice Requires="wps">
+            <w:drawing>
+              <wp:anchor distT="0" distB="0" distL="114300" distR="114300" simplePos="0" relativeHeight="251659264" behindDoc="0" locked="0" layoutInCell="1" allowOverlap="1" wp14:anchorId="4D4505F9" wp14:editId="10B34914">
+                <wp:simplePos x="0" y="0"/>
+                <wp:positionH relativeFrom="column">
+                  <wp:posOffset>2302510</wp:posOffset>
+                </wp:positionH>
+                <wp:positionV relativeFrom="paragraph">
+                  <wp:posOffset>-584200</wp:posOffset>
+                </wp:positionV>
+                <wp:extent cx="4182110" cy="2489200"/>
+                <wp:effectExtent l="0" t="0" r="27940" b="25400"/>
+                <wp:wrapNone/>
+                <wp:docPr id="1920801241" name="Rectangle 1"/>
+                <wp:cNvGraphicFramePr/>
+                <a:graphic xmlns:a="http://schemas.openxmlformats.org/drawingml/2006/main">
+                  <a:graphicData uri="http://schemas.microsoft.com/office/word/2010/wordprocessingShape">
+                    <wps:wsp>
+                      <wps:cNvSpPr/>
+                      <wps:spPr>
+                        <a:xfrm>
+                          <a:off x="0" y="0"/>
+                          <a:ext cx="4182110" cy="2489200"/>
+                        </a:xfrm>
+                        <a:prstGeom prst="rect">
+                          <a:avLst/>
+                        </a:prstGeom>
+                      </wps:spPr>
+                      <wps:style>
+                        <a:lnRef idx="2">
+                          <a:schemeClr val="accent1">
+                            <a:shade val="15000"/>
+                          </a:schemeClr>
+                        </a:lnRef>
+                        <a:fillRef idx="1">
+                          <a:schemeClr val="accent1"/>
+                        </a:fillRef>
+                        <a:effectRef idx="0">
+                          <a:schemeClr val="accent1"/>
+                        </a:effectRef>
+                        <a:fontRef idx="minor">
+                          <a:schemeClr val="lt1"/>
+                        </a:fontRef>
+                      </wps:style>
+                      <wps:bodyPr rot="0" spcFirstLastPara="0" vertOverflow="overflow" horzOverflow="overflow" vert="horz" wrap="square" lIns="91440" tIns="45720" rIns="91440" bIns="45720" numCol="1" spcCol="0" rtlCol="0" fromWordArt="0" anchor="ctr" anchorCtr="0" forceAA="0" compatLnSpc="1">
+                        <a:prstTxWarp prst="textNoShape">
+                          <a:avLst/>
+                        </a:prstTxWarp>
+                        <a:noAutofit/>
+                      </wps:bodyPr>
+                    </wps:wsp>
+                  </a:graphicData>
+                </a:graphic>
+                <wp14:sizeRelH relativeFrom="margin">
+                  <wp14:pctWidth>0</wp14:pctWidth>
+                </wp14:sizeRelH>
+                <wp14:sizeRelV relativeFrom="margin">
+                  <wp14:pctHeight>0</wp14:pctHeight>
+                </wp14:sizeRelV>
+              </wp:anchor>
+            </w:drawing>
+          </mc:Choice>
+          <mc:Fallback>
+            <w:pict>
+              <v:rect w14:anchorId="5D2AE1BD" id="Rectangle 1" o:spid="_x0000_s1026" style="position:absolute;margin-left:181.3pt;margin-top:-46pt;width:329.3pt;height:196pt;z-index:251659264;visibility:visible;mso-wrap-style:square;mso-width-percent:0;mso-height-percent:0;mso-wrap-distance-left:9pt;mso-wrap-distance-top:0;mso-wrap-distance-right:9pt;mso-wrap-distance-bottom:0;mso-position-horizontal:absolute;mso-position-horizontal-relative:text;mso-position-vertical:absolute;mso-position-vertical-relative:text;mso-width-percent:0;mso-height-percent:0;mso-width-relative:margin;mso-height-relative:margin;v-text-anchor:middle" o:gfxdata="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" fillcolor="#156082 [3204]" strokecolor="#030e13 [484]" strokeweight="1.5pt"/>
+            </w:pict>
+          </mc:Fallback>
+        </mc:AlternateContent>
+      </w:r>
+      <w:r>
+        <w:rPr>
+          <w:noProof/>
+        </w:rPr>
+        <mc:AlternateContent>
+          <mc:Choice Requires="wps">
+            <w:drawing>
+              <wp:anchor distT="0" distB="0" distL="114300" distR="114300" simplePos="0" relativeHeight="251696128" behindDoc="0" locked="0" layoutInCell="1" allowOverlap="1" wp14:anchorId="7603A7D4" wp14:editId="455440DF">
+                <wp:simplePos x="0" y="0"/>
+                <wp:positionH relativeFrom="column">
+                  <wp:posOffset>1104900</wp:posOffset>
+                </wp:positionH>
+                <wp:positionV relativeFrom="paragraph">
+                  <wp:posOffset>1507067</wp:posOffset>
+                </wp:positionV>
+                <wp:extent cx="914400" cy="850900"/>
+                <wp:effectExtent l="0" t="0" r="19050" b="25400"/>
+                <wp:wrapNone/>
+                <wp:docPr id="595554245" name="Text Box 30"/>
+                <wp:cNvGraphicFramePr/>
+                <a:graphic xmlns:a="http://schemas.openxmlformats.org/drawingml/2006/main">
+                  <a:graphicData uri="http://schemas.microsoft.com/office/word/2010/wordprocessingShape">
+                    <wps:wsp>
+                      <wps:cNvSpPr txBox="1"/>
+                      <wps:spPr>
+                        <a:xfrm>
+                          <a:off x="0" y="0"/>
+                          <a:ext cx="914400" cy="850900"/>
+                        </a:xfrm>
+                        <a:prstGeom prst="rect">
+                          <a:avLst/>
+                        </a:prstGeom>
+                        <a:solidFill>
+                          <a:schemeClr val="lt1"/>
+                        </a:solidFill>
+                        <a:ln w="6350">
+                          <a:solidFill>
+                            <a:prstClr val="black"/>
+                          </a:solidFill>
+                        </a:ln>
+                      </wps:spPr>
+                      <wps:txbx>
+                        <w:txbxContent>
+                          <w:p>
+                            <w:pPr>
+                              <w:rPr>
+                                <w:sz w:val="16"/>
+                                <w:szCs w:val="16"/>
+                              </w:rPr>
+                            </w:pPr>
+                            <w:r>
+                              <w:rPr>
+                                <w:sz w:val="16"/>
+                                <w:szCs w:val="16"/>
+                              </w:rPr>
+                              <w:t>&lt;Provider store={AppStore}&gt;</w:t>
+                            </w:r>
+                            <w:r>
+                              <w:rPr>
+                                <w:sz w:val="16"/>
+                                <w:szCs w:val="16"/>
+                              </w:rPr>
+                              <w:t xml:space="preserve"> &lt;App/&gt;</w:t>
+                            </w:r>
+                          </w:p>
+                          <w:p>
+                            <w:pPr>
+                              <w:rPr>
+                                <w:sz w:val="16"/>
+                                <w:szCs w:val="16"/>
+                              </w:rPr>
+                            </w:pPr>
+                            <w:r>
+                              <w:rPr>
+                                <w:sz w:val="16"/>
+                                <w:szCs w:val="16"/>
+                              </w:rPr>
+                              <w:t>&lt;/</w:t>
+                            </w:r>
+                            <w:r>
+                              <w:rPr>
+                                <w:sz w:val="16"/>
+                                <w:szCs w:val="16"/>
+                              </w:rPr>
+                              <w:t>Provider</w:t>
+                            </w:r>
+                            <w:r>
+                              <w:rPr>
+                                <w:sz w:val="16"/>
+                                <w:szCs w:val="16"/>
+                              </w:rPr>
+                              <w:t>&gt;</w:t>
+                            </w:r>
+                          </w:p>
+                        </w:txbxContent>
+                      </wps:txbx>
+                      <wps:bodyPr rot="0" spcFirstLastPara="0" vertOverflow="overflow" horzOverflow="overflow" vert="horz" wrap="square" lIns="91440" tIns="45720" rIns="91440" bIns="45720" numCol="1" spcCol="0" rtlCol="0" fromWordArt="0" anchor="t" anchorCtr="0" forceAA="0" compatLnSpc="1">
+                        <a:prstTxWarp prst="textNoShape">
+                          <a:avLst/>
+                        </a:prstTxWarp>
+                        <a:noAutofit/>
+                      </wps:bodyPr>
+                    </wps:wsp>
+                  </a:graphicData>
+                </a:graphic>
+              </wp:anchor>
+            </w:drawing>
+          </mc:Choice>
+          <mc:Fallback>
+            <w:pict>
+              <v:shape w14:anchorId="7603A7D4" id="Text Box 30" o:spid="_x0000_s1033" type="#_x0000_t202" style="position:absolute;margin-left:87pt;margin-top:118.65pt;width:1in;height:67pt;z-index:251696128;visibility:visible;mso-wrap-style:square;mso-wrap-distance-left:9pt;mso-wrap-distance-top:0;mso-wrap-distance-right:9pt;mso-wrap-distance-bottom:0;mso-position-horizontal:absolute;mso-position-horizontal-relative:text;mso-position-vertical:absolute;mso-position-vertical-relative:text;v-text-anchor:top" o:gfxdata="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" fillcolor="white [3201]" strokeweight=".5pt">
+                <v:textbox>
+                  <w:txbxContent>
+                    <w:p>
+                      <w:pPr>
+                        <w:rPr>
+                          <w:sz w:val="16"/>
+                          <w:szCs w:val="16"/>
+                        </w:rPr>
+                      </w:pPr>
+                      <w:r>
+                        <w:rPr>
+                          <w:sz w:val="16"/>
+                          <w:szCs w:val="16"/>
+                        </w:rPr>
+                        <w:t>&lt;Provider store={AppStore}&gt;</w:t>
+                      </w:r>
+                      <w:r>
+                        <w:rPr>
+                          <w:sz w:val="16"/>
+                          <w:szCs w:val="16"/>
+                        </w:rPr>
+                        <w:t xml:space="preserve"> &lt;App/&gt;</w:t>
+                      </w:r>
+                    </w:p>
+                    <w:p>
+                      <w:pPr>
+                        <w:rPr>
+                          <w:sz w:val="16"/>
+                          <w:szCs w:val="16"/>
+                        </w:rPr>
+                      </w:pPr>
+                      <w:r>
+                        <w:rPr>
+                          <w:sz w:val="16"/>
+                          <w:szCs w:val="16"/>
+                        </w:rPr>
+                        <w:t>&lt;/</w:t>
+                      </w:r>
+                      <w:r>
+                        <w:rPr>
+                          <w:sz w:val="16"/>
+                          <w:szCs w:val="16"/>
+                        </w:rPr>
+                        <w:t>Provider</w:t>
+                      </w:r>
+                      <w:r>
+                        <w:rPr>
+                          <w:sz w:val="16"/>
+                          <w:szCs w:val="16"/>
+                        </w:rPr>
+                        <w:t>&gt;</w:t>
+                      </w:r>
+                    </w:p>
+                  </w:txbxContent>
+                </v:textbox>
               </v:shape>
             </w:pict>
           </mc:Fallback>
@@ -403,7 +1897,7 @@
           </mc:Choice>
           <mc:Fallback>
             <w:pict>
-              <v:roundrect w14:anchorId="4EDFE922" id="Rectangle: Rounded Corners 16" o:spid="_x0000_s1027" style="position:absolute;margin-left:-32.25pt;margin-top:203.65pt;width:70.95pt;height:36.65pt;z-index:251685888;visibility:visible;mso-wrap-style:square;mso-wrap-distance-left:9pt;mso-wrap-distance-top:0;mso-wrap-distance-right:9pt;mso-wrap-distance-bottom:0;mso-position-horizontal:absolute;mso-position-horizontal-relative:text;mso-position-vertical:absolute;mso-position-vertical-relative:text;v-text-anchor:middle" arcsize="10923f" o:gfxdata="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" fillcolor="#156082 [3204]" strokecolor="#030e13 [484]" strokeweight="1.5pt">
+              <v:roundrect w14:anchorId="4EDFE922" id="Rectangle: Rounded Corners 16" o:spid="_x0000_s1034" style="position:absolute;margin-left:-32.25pt;margin-top:203.65pt;width:70.95pt;height:36.65pt;z-index:251685888;visibility:visible;mso-wrap-style:square;mso-wrap-distance-left:9pt;mso-wrap-distance-top:0;mso-wrap-distance-right:9pt;mso-wrap-distance-bottom:0;mso-position-horizontal:absolute;mso-position-horizontal-relative:text;mso-position-vertical:absolute;mso-position-vertical-relative:text;v-text-anchor:middle" arcsize="10923f" o:gfxdata="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" fillcolor="#156082 [3204]" strokecolor="#030e13 [484]" strokeweight="1.5pt">
                 <v:stroke joinstyle="miter"/>
                 <v:textbox>
                   <w:txbxContent>
@@ -495,7 +1989,7 @@
         <mc:AlternateContent>
           <mc:Choice Requires="wps">
             <w:drawing>
-              <wp:anchor distT="0" distB="0" distL="114300" distR="114300" simplePos="0" relativeHeight="251695104" behindDoc="0" locked="0" layoutInCell="1" allowOverlap="1" wp14:anchorId="67492159" wp14:editId="5C06211D">
+              <wp:anchor distT="0" distB="0" distL="114300" distR="114300" simplePos="0" relativeHeight="251695104" behindDoc="0" locked="0" layoutInCell="1" allowOverlap="1" wp14:anchorId="67492159" wp14:editId="6C342A28">
                 <wp:simplePos x="0" y="0"/>
                 <wp:positionH relativeFrom="column">
                   <wp:posOffset>927100</wp:posOffset>
@@ -572,7 +2066,7 @@
           </mc:Choice>
           <mc:Fallback>
             <w:pict>
-              <v:roundrect w14:anchorId="67492159" id="Rectangle: Rounded Corners 28" o:spid="_x0000_s1028" style="position:absolute;margin-left:73pt;margin-top:58.35pt;width:92pt;height:26.35pt;z-index:251695104;visibility:visible;mso-wrap-style:square;mso-height-percent:0;mso-wrap-distance-left:9pt;mso-wrap-distance-top:0;mso-wrap-distance-right:9pt;mso-wrap-distance-bottom:0;mso-position-horizontal:absolute;mso-position-horizontal-relative:text;mso-position-vertical:absolute;mso-position-vertical-relative:text;mso-height-percent:0;mso-height-relative:margin;v-text-anchor:middle" arcsize="10923f" o:gfxdata="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" fillcolor="gray [1629]" strokecolor="#030e13 [484]" strokeweight="1.5pt">
+              <v:roundrect w14:anchorId="67492159" id="Rectangle: Rounded Corners 28" o:spid="_x0000_s1035" style="position:absolute;margin-left:73pt;margin-top:58.35pt;width:92pt;height:26.35pt;z-index:251695104;visibility:visible;mso-wrap-style:square;mso-height-percent:0;mso-wrap-distance-left:9pt;mso-wrap-distance-top:0;mso-wrap-distance-right:9pt;mso-wrap-distance-bottom:0;mso-position-horizontal:absolute;mso-position-horizontal-relative:text;mso-position-vertical:absolute;mso-position-vertical-relative:text;mso-height-percent:0;mso-height-relative:margin;v-text-anchor:middle" arcsize="10923f" o:gfxdata="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" fillcolor="gray [1629]" strokecolor="#030e13 [484]" strokeweight="1.5pt">
                 <v:stroke joinstyle="miter"/>
                 <v:textbox>
                   <w:txbxContent>
@@ -729,18 +2223,59 @@
                           <w:p>
                             <w:pPr>
                               <w:jc w:val="center"/>
+                              <w:rPr>
+                                <w:sz w:val="20"/>
+                                <w:szCs w:val="20"/>
+                              </w:rPr>
                             </w:pPr>
                             <w:r>
+                              <w:rPr>
+                                <w:sz w:val="20"/>
+                                <w:szCs w:val="20"/>
+                              </w:rPr>
                               <w:t>t</w:t>
                             </w:r>
                             <w:r>
+                              <w:rPr>
+                                <w:sz w:val="20"/>
+                                <w:szCs w:val="20"/>
+                              </w:rPr>
                               <w:t>ype:</w:t>
                             </w:r>
                             <w:r>
+                              <w:rPr>
+                                <w:sz w:val="20"/>
+                                <w:szCs w:val="20"/>
+                              </w:rPr>
                               <w:t xml:space="preserve"> </w:t>
                             </w:r>
                             <w:r>
-                              <w:t>’save’, payload: []</w:t>
+                              <w:rPr>
+                                <w:sz w:val="20"/>
+                                <w:szCs w:val="20"/>
+                              </w:rPr>
+                              <w:t>’</w:t>
+                            </w:r>
+                            <w:r>
+                              <w:rPr>
+                                <w:sz w:val="20"/>
+                                <w:szCs w:val="20"/>
+                              </w:rPr>
+                              <w:t>increase</w:t>
+                            </w:r>
+                            <w:r>
+                              <w:rPr>
+                                <w:sz w:val="20"/>
+                                <w:szCs w:val="20"/>
+                              </w:rPr>
+                              <w:t xml:space="preserve">’, payload: </w:t>
+                            </w:r>
+                            <w:r>
+                              <w:rPr>
+                                <w:sz w:val="20"/>
+                                <w:szCs w:val="20"/>
+                              </w:rPr>
+                              <w:t>1</w:t>
                             </w:r>
                           </w:p>
                         </w:txbxContent>
@@ -762,25 +2297,66 @@
           </mc:Choice>
           <mc:Fallback>
             <w:pict>
-              <v:roundrect w14:anchorId="15629D3F" id="Rectangle: Rounded Corners 25" o:spid="_x0000_s1029" style="position:absolute;margin-left:55pt;margin-top:5pt;width:142.65pt;height:24.65pt;z-index:251693056;visibility:visible;mso-wrap-style:square;mso-width-percent:0;mso-wrap-distance-left:9pt;mso-wrap-distance-top:0;mso-wrap-distance-right:9pt;mso-wrap-distance-bottom:0;mso-position-horizontal:absolute;mso-position-horizontal-relative:text;mso-position-vertical:absolute;mso-position-vertical-relative:text;mso-width-percent:0;mso-width-relative:margin;v-text-anchor:middle" arcsize="10923f" o:gfxdata="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" fillcolor="#124f1a [2406]" strokecolor="#030e13 [484]" strokeweight="1.5pt">
+              <v:roundrect w14:anchorId="15629D3F" id="Rectangle: Rounded Corners 25" o:spid="_x0000_s1036" style="position:absolute;margin-left:55pt;margin-top:5pt;width:142.65pt;height:24.65pt;z-index:251693056;visibility:visible;mso-wrap-style:square;mso-width-percent:0;mso-wrap-distance-left:9pt;mso-wrap-distance-top:0;mso-wrap-distance-right:9pt;mso-wrap-distance-bottom:0;mso-position-horizontal:absolute;mso-position-horizontal-relative:text;mso-position-vertical:absolute;mso-position-vertical-relative:text;mso-width-percent:0;mso-width-relative:margin;v-text-anchor:middle" arcsize="10923f" o:gfxdata="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" fillcolor="#124f1a [2406]" strokecolor="#030e13 [484]" strokeweight="1.5pt">
                 <v:stroke joinstyle="miter"/>
                 <v:textbox>
                   <w:txbxContent>
                     <w:p>
                       <w:pPr>
                         <w:jc w:val="center"/>
+                        <w:rPr>
+                          <w:sz w:val="20"/>
+                          <w:szCs w:val="20"/>
+                        </w:rPr>
                       </w:pPr>
                       <w:r>
+                        <w:rPr>
+                          <w:sz w:val="20"/>
+                          <w:szCs w:val="20"/>
+                        </w:rPr>
                         <w:t>t</w:t>
                       </w:r>
                       <w:r>
+                        <w:rPr>
+                          <w:sz w:val="20"/>
+                          <w:szCs w:val="20"/>
+                        </w:rPr>
                         <w:t>ype:</w:t>
                       </w:r>
                       <w:r>
+                        <w:rPr>
+                          <w:sz w:val="20"/>
+                          <w:szCs w:val="20"/>
+                        </w:rPr>
                         <w:t xml:space="preserve"> </w:t>
                       </w:r>
                       <w:r>
-                        <w:t>’save’, payload: []</w:t>
+                        <w:rPr>
+                          <w:sz w:val="20"/>
+                          <w:szCs w:val="20"/>
+                        </w:rPr>
+                        <w:t>’</w:t>
+                      </w:r>
+                      <w:r>
+                        <w:rPr>
+                          <w:sz w:val="20"/>
+                          <w:szCs w:val="20"/>
+                        </w:rPr>
+                        <w:t>increase</w:t>
+                      </w:r>
+                      <w:r>
+                        <w:rPr>
+                          <w:sz w:val="20"/>
+                          <w:szCs w:val="20"/>
+                        </w:rPr>
+                        <w:t xml:space="preserve">’, payload: </w:t>
+                      </w:r>
+                      <w:r>
+                        <w:rPr>
+                          <w:sz w:val="20"/>
+                          <w:szCs w:val="20"/>
+                        </w:rPr>
+                        <w:t>1</w:t>
                       </w:r>
                     </w:p>
                   </w:txbxContent>
@@ -869,7 +2445,7 @@
         <mc:AlternateContent>
           <mc:Choice Requires="wps">
             <w:drawing>
-              <wp:anchor distT="0" distB="0" distL="114300" distR="114300" simplePos="0" relativeHeight="251691008" behindDoc="0" locked="0" layoutInCell="1" allowOverlap="1" wp14:anchorId="64512BDA" wp14:editId="1E4B1544">
+              <wp:anchor distT="0" distB="0" distL="114300" distR="114300" simplePos="0" relativeHeight="251691008" behindDoc="0" locked="0" layoutInCell="1" allowOverlap="1" wp14:anchorId="64512BDA" wp14:editId="7A199701">
                 <wp:simplePos x="0" y="0"/>
                 <wp:positionH relativeFrom="column">
                   <wp:posOffset>-211667</wp:posOffset>
@@ -939,7 +2515,7 @@
           </mc:Choice>
           <mc:Fallback>
             <w:pict>
-              <v:shape w14:anchorId="64512BDA" id="Text Box 23" o:spid="_x0000_s1030" type="#_x0000_t202" style="position:absolute;margin-left:-16.65pt;margin-top:110.65pt;width:48.35pt;height:23.65pt;z-index:251691008;visibility:visible;mso-wrap-style:square;mso-wrap-distance-left:9pt;mso-wrap-distance-top:0;mso-wrap-distance-right:9pt;mso-wrap-distance-bottom:0;mso-position-horizontal:absolute;mso-position-horizontal-relative:text;mso-position-vertical:absolute;mso-position-vertical-relative:text;v-text-anchor:top" o:gfxdata="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" fillcolor="#45b0e1 [1940]" strokeweight=".5pt">
+              <v:shape w14:anchorId="64512BDA" id="Text Box 23" o:spid="_x0000_s1037" type="#_x0000_t202" style="position:absolute;margin-left:-16.65pt;margin-top:110.65pt;width:48.35pt;height:23.65pt;z-index:251691008;visibility:visible;mso-wrap-style:square;mso-wrap-distance-left:9pt;mso-wrap-distance-top:0;mso-wrap-distance-right:9pt;mso-wrap-distance-bottom:0;mso-position-horizontal:absolute;mso-position-horizontal-relative:text;mso-position-vertical:absolute;mso-position-vertical-relative:text;v-text-anchor:top" o:gfxdata="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" fillcolor="#45b0e1 [1940]" strokeweight=".5pt">
                 <v:textbox>
                   <w:txbxContent>
                     <w:p>
@@ -955,111 +2531,6 @@
                           <w:szCs w:val="16"/>
                         </w:rPr>
                         <w:t>products</w:t>
-                      </w:r>
-                    </w:p>
-                  </w:txbxContent>
-                </v:textbox>
-              </v:shape>
-            </w:pict>
-          </mc:Fallback>
-        </mc:AlternateContent>
-      </w:r>
-      <w:r>
-        <w:rPr>
-          <w:noProof/>
-        </w:rPr>
-        <mc:AlternateContent>
-          <mc:Choice Requires="wps">
-            <w:drawing>
-              <wp:anchor distT="0" distB="0" distL="114300" distR="114300" simplePos="0" relativeHeight="251689984" behindDoc="0" locked="0" layoutInCell="1" allowOverlap="1" wp14:anchorId="098DDCBD" wp14:editId="417B8328">
-                <wp:simplePos x="0" y="0"/>
-                <wp:positionH relativeFrom="column">
-                  <wp:posOffset>867833</wp:posOffset>
-                </wp:positionH>
-                <wp:positionV relativeFrom="paragraph">
-                  <wp:posOffset>414867</wp:posOffset>
-                </wp:positionV>
-                <wp:extent cx="1134110" cy="296333"/>
-                <wp:effectExtent l="0" t="0" r="27940" b="27940"/>
-                <wp:wrapNone/>
-                <wp:docPr id="701534954" name="Text Box 22"/>
-                <wp:cNvGraphicFramePr/>
-                <a:graphic xmlns:a="http://schemas.openxmlformats.org/drawingml/2006/main">
-                  <a:graphicData uri="http://schemas.microsoft.com/office/word/2010/wordprocessingShape">
-                    <wps:wsp>
-                      <wps:cNvSpPr txBox="1"/>
-                      <wps:spPr>
-                        <a:xfrm>
-                          <a:off x="0" y="0"/>
-                          <a:ext cx="1134110" cy="296333"/>
-                        </a:xfrm>
-                        <a:prstGeom prst="rect">
-                          <a:avLst/>
-                        </a:prstGeom>
-                        <a:solidFill>
-                          <a:schemeClr val="accent1">
-                            <a:lumMod val="60000"/>
-                            <a:lumOff val="40000"/>
-                          </a:schemeClr>
-                        </a:solidFill>
-                        <a:ln w="6350">
-                          <a:solidFill>
-                            <a:prstClr val="black"/>
-                          </a:solidFill>
-                        </a:ln>
-                      </wps:spPr>
-                      <wps:txbx>
-                        <w:txbxContent>
-                          <w:p>
-                            <w:pPr>
-                              <w:rPr>
-                                <w:sz w:val="16"/>
-                                <w:szCs w:val="16"/>
-                              </w:rPr>
-                            </w:pPr>
-                            <w:r>
-                              <w:rPr>
-                                <w:sz w:val="16"/>
-                                <w:szCs w:val="16"/>
-                              </w:rPr>
-                              <w:t>Subscribed to Prop1</w:t>
-                            </w:r>
-                          </w:p>
-                        </w:txbxContent>
-                      </wps:txbx>
-                      <wps:bodyPr rot="0" spcFirstLastPara="0" vertOverflow="overflow" horzOverflow="overflow" vert="horz" wrap="square" lIns="91440" tIns="45720" rIns="91440" bIns="45720" numCol="1" spcCol="0" rtlCol="0" fromWordArt="0" anchor="t" anchorCtr="0" forceAA="0" compatLnSpc="1">
-                        <a:prstTxWarp prst="textNoShape">
-                          <a:avLst/>
-                        </a:prstTxWarp>
-                        <a:noAutofit/>
-                      </wps:bodyPr>
-                    </wps:wsp>
-                  </a:graphicData>
-                </a:graphic>
-                <wp14:sizeRelH relativeFrom="margin">
-                  <wp14:pctWidth>0</wp14:pctWidth>
-                </wp14:sizeRelH>
-              </wp:anchor>
-            </w:drawing>
-          </mc:Choice>
-          <mc:Fallback>
-            <w:pict>
-              <v:shape w14:anchorId="098DDCBD" id="Text Box 22" o:spid="_x0000_s1031" type="#_x0000_t202" style="position:absolute;margin-left:68.35pt;margin-top:32.65pt;width:89.3pt;height:23.35pt;z-index:251689984;visibility:visible;mso-wrap-style:square;mso-width-percent:0;mso-wrap-distance-left:9pt;mso-wrap-distance-top:0;mso-wrap-distance-right:9pt;mso-wrap-distance-bottom:0;mso-position-horizontal:absolute;mso-position-horizontal-relative:text;mso-position-vertical:absolute;mso-position-vertical-relative:text;mso-width-percent:0;mso-width-relative:margin;v-text-anchor:top" o:gfxdata="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" fillcolor="#45b0e1 [1940]" strokeweight=".5pt">
-                <v:textbox>
-                  <w:txbxContent>
-                    <w:p>
-                      <w:pPr>
-                        <w:rPr>
-                          <w:sz w:val="16"/>
-                          <w:szCs w:val="16"/>
-                        </w:rPr>
-                      </w:pPr>
-                      <w:r>
-                        <w:rPr>
-                          <w:sz w:val="16"/>
-                          <w:szCs w:val="16"/>
-                        </w:rPr>
-                        <w:t>Subscribed to Prop1</w:t>
                       </w:r>
                     </w:p>
                   </w:txbxContent>
@@ -1337,18 +2808,18 @@
         <mc:AlternateContent>
           <mc:Choice Requires="wps">
             <w:drawing>
-              <wp:anchor distT="0" distB="0" distL="114300" distR="114300" simplePos="0" relativeHeight="251683840" behindDoc="0" locked="0" layoutInCell="1" allowOverlap="1" wp14:anchorId="6BB1272D" wp14:editId="13C3E9FE">
+              <wp:anchor distT="0" distB="0" distL="114300" distR="114300" simplePos="0" relativeHeight="251681792" behindDoc="0" locked="0" layoutInCell="1" allowOverlap="1" wp14:anchorId="0F36F4A3" wp14:editId="6E2C33E9">
                 <wp:simplePos x="0" y="0"/>
                 <wp:positionH relativeFrom="column">
-                  <wp:posOffset>5130588</wp:posOffset>
+                  <wp:posOffset>5100955</wp:posOffset>
                 </wp:positionH>
                 <wp:positionV relativeFrom="paragraph">
-                  <wp:posOffset>1436794</wp:posOffset>
+                  <wp:posOffset>772372</wp:posOffset>
                 </wp:positionV>
                 <wp:extent cx="258233" cy="8467"/>
                 <wp:effectExtent l="0" t="57150" r="27940" b="86995"/>
                 <wp:wrapNone/>
-                <wp:docPr id="147319333" name="Straight Arrow Connector 14"/>
+                <wp:docPr id="1586049546" name="Straight Arrow Connector 14"/>
                 <wp:cNvGraphicFramePr/>
                 <a:graphic xmlns:a="http://schemas.openxmlformats.org/drawingml/2006/main">
                   <a:graphicData uri="http://schemas.microsoft.com/office/word/2010/wordprocessingShape">
@@ -1389,73 +2860,7 @@
           </mc:Choice>
           <mc:Fallback>
             <w:pict>
-              <v:shape w14:anchorId="61D2F3D2" id="Straight Arrow Connector 14" o:spid="_x0000_s1026" type="#_x0000_t32" style="position:absolute;margin-left:404pt;margin-top:113.15pt;width:20.35pt;height:.65pt;z-index:251683840;visibility:visible;mso-wrap-style:square;mso-wrap-distance-left:9pt;mso-wrap-distance-top:0;mso-wrap-distance-right:9pt;mso-wrap-distance-bottom:0;mso-position-horizontal:absolute;mso-position-horizontal-relative:text;mso-position-vertical:absolute;mso-position-vertical-relative:text" o:gfxdata="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" strokecolor="black [3200]" strokeweight="1.5pt">
-                <v:stroke endarrow="block" joinstyle="miter"/>
-              </v:shape>
-            </w:pict>
-          </mc:Fallback>
-        </mc:AlternateContent>
-      </w:r>
-      <w:r>
-        <w:rPr>
-          <w:noProof/>
-        </w:rPr>
-        <mc:AlternateContent>
-          <mc:Choice Requires="wps">
-            <w:drawing>
-              <wp:anchor distT="0" distB="0" distL="114300" distR="114300" simplePos="0" relativeHeight="251681792" behindDoc="0" locked="0" layoutInCell="1" allowOverlap="1" wp14:anchorId="0F36F4A3" wp14:editId="7480984E">
-                <wp:simplePos x="0" y="0"/>
-                <wp:positionH relativeFrom="column">
-                  <wp:posOffset>5100955</wp:posOffset>
-                </wp:positionH>
-                <wp:positionV relativeFrom="paragraph">
-                  <wp:posOffset>772372</wp:posOffset>
-                </wp:positionV>
-                <wp:extent cx="258233" cy="8467"/>
-                <wp:effectExtent l="0" t="57150" r="27940" b="86995"/>
-                <wp:wrapNone/>
-                <wp:docPr id="1586049546" name="Straight Arrow Connector 14"/>
-                <wp:cNvGraphicFramePr/>
-                <a:graphic xmlns:a="http://schemas.openxmlformats.org/drawingml/2006/main">
-                  <a:graphicData uri="http://schemas.microsoft.com/office/word/2010/wordprocessingShape">
-                    <wps:wsp>
-                      <wps:cNvCnPr/>
-                      <wps:spPr>
-                        <a:xfrm>
-                          <a:off x="0" y="0"/>
-                          <a:ext cx="258233" cy="8467"/>
-                        </a:xfrm>
-                        <a:prstGeom prst="straightConnector1">
-                          <a:avLst/>
-                        </a:prstGeom>
-                        <a:ln>
-                          <a:tailEnd type="triangle"/>
-                        </a:ln>
-                      </wps:spPr>
-                      <wps:style>
-                        <a:lnRef idx="2">
-                          <a:schemeClr val="dk1"/>
-                        </a:lnRef>
-                        <a:fillRef idx="0">
-                          <a:schemeClr val="dk1"/>
-                        </a:fillRef>
-                        <a:effectRef idx="1">
-                          <a:schemeClr val="dk1"/>
-                        </a:effectRef>
-                        <a:fontRef idx="minor">
-                          <a:schemeClr val="tx1"/>
-                        </a:fontRef>
-                      </wps:style>
-                      <wps:bodyPr/>
-                    </wps:wsp>
-                  </a:graphicData>
-                </a:graphic>
-              </wp:anchor>
-            </w:drawing>
-          </mc:Choice>
-          <mc:Fallback>
-            <w:pict>
-              <v:shape w14:anchorId="7FC101B1" id="Straight Arrow Connector 14" o:spid="_x0000_s1026" type="#_x0000_t32" style="position:absolute;margin-left:401.65pt;margin-top:60.8pt;width:20.35pt;height:.65pt;z-index:251681792;visibility:visible;mso-wrap-style:square;mso-wrap-distance-left:9pt;mso-wrap-distance-top:0;mso-wrap-distance-right:9pt;mso-wrap-distance-bottom:0;mso-position-horizontal:absolute;mso-position-horizontal-relative:text;mso-position-vertical:absolute;mso-position-vertical-relative:text" o:gfxdata="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" strokecolor="black [3200]" strokeweight="1.5pt">
+              <v:shape w14:anchorId="6FCF5706" id="Straight Arrow Connector 14" o:spid="_x0000_s1026" type="#_x0000_t32" style="position:absolute;margin-left:401.65pt;margin-top:60.8pt;width:20.35pt;height:.65pt;z-index:251681792;visibility:visible;mso-wrap-style:square;mso-wrap-distance-left:9pt;mso-wrap-distance-top:0;mso-wrap-distance-right:9pt;mso-wrap-distance-bottom:0;mso-position-horizontal:absolute;mso-position-horizontal-relative:text;mso-position-vertical:absolute;mso-position-vertical-relative:text" o:gfxdata="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" strokecolor="black [3200]" strokeweight="1.5pt">
                 <v:stroke endarrow="block" joinstyle="miter"/>
               </v:shape>
             </w:pict>
@@ -1521,7 +2926,7 @@
           </mc:Choice>
           <mc:Fallback>
             <w:pict>
-              <v:shapetype w14:anchorId="7057A9B9" id="_x0000_t32" coordsize="21600,21600" o:spt="32" o:oned="t" path="m,l21600,21600e" filled="f">
+              <v:shapetype w14:anchorId="3528ED8B" id="_x0000_t32" coordsize="21600,21600" o:spt="32" o:oned="t" path="m,l21600,21600e" filled="f">
                 <v:path arrowok="t" fillok="f" o:connecttype="none"/>
                 <o:lock v:ext="edit" shapetype="t"/>
               </v:shapetype>
@@ -1539,7 +2944,7 @@
         <mc:AlternateContent>
           <mc:Choice Requires="wps">
             <w:drawing>
-              <wp:anchor distT="0" distB="0" distL="114300" distR="114300" simplePos="0" relativeHeight="251676672" behindDoc="0" locked="0" layoutInCell="1" allowOverlap="1" wp14:anchorId="72561341" wp14:editId="0938803E">
+              <wp:anchor distT="0" distB="0" distL="114300" distR="114300" simplePos="0" relativeHeight="251676672" behindDoc="0" locked="0" layoutInCell="1" allowOverlap="1" wp14:anchorId="72561341" wp14:editId="504C257A">
                 <wp:simplePos x="0" y="0"/>
                 <wp:positionH relativeFrom="column">
                   <wp:posOffset>931333</wp:posOffset>
@@ -1592,429 +2997,9 @@
           </mc:Choice>
           <mc:Fallback>
             <w:pict>
-              <v:shape w14:anchorId="272F8EE7" id="Straight Arrow Connector 11" o:spid="_x0000_s1026" type="#_x0000_t32" style="position:absolute;margin-left:73.35pt;margin-top:145.35pt;width:105.35pt;height:0;z-index:251676672;visibility:visible;mso-wrap-style:square;mso-wrap-distance-left:9pt;mso-wrap-distance-top:0;mso-wrap-distance-right:9pt;mso-wrap-distance-bottom:0;mso-position-horizontal:absolute;mso-position-horizontal-relative:text;mso-position-vertical:absolute;mso-position-vertical-relative:text" o:gfxdata="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" strokecolor="#4ea72e [3209]" strokeweight="1pt">
+              <v:shape w14:anchorId="3D246A94" id="Straight Arrow Connector 11" o:spid="_x0000_s1026" type="#_x0000_t32" style="position:absolute;margin-left:73.35pt;margin-top:145.35pt;width:105.35pt;height:0;z-index:251676672;visibility:visible;mso-wrap-style:square;mso-wrap-distance-left:9pt;mso-wrap-distance-top:0;mso-wrap-distance-right:9pt;mso-wrap-distance-bottom:0;mso-position-horizontal:absolute;mso-position-horizontal-relative:text;mso-position-vertical:absolute;mso-position-vertical-relative:text" o:gfxdata="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" strokecolor="#4ea72e [3209]" strokeweight="1pt">
                 <v:stroke startarrow="block" endarrow="block" joinstyle="miter"/>
               </v:shape>
-            </w:pict>
-          </mc:Fallback>
-        </mc:AlternateContent>
-      </w:r>
-      <w:r>
-        <w:rPr>
-          <w:noProof/>
-        </w:rPr>
-        <mc:AlternateContent>
-          <mc:Choice Requires="wps">
-            <w:drawing>
-              <wp:anchor distT="0" distB="0" distL="114300" distR="114300" simplePos="0" relativeHeight="251675648" behindDoc="0" locked="0" layoutInCell="1" allowOverlap="1" wp14:anchorId="11B99808" wp14:editId="72DCFF41">
-                <wp:simplePos x="0" y="0"/>
-                <wp:positionH relativeFrom="column">
-                  <wp:posOffset>3716867</wp:posOffset>
-                </wp:positionH>
-                <wp:positionV relativeFrom="paragraph">
-                  <wp:posOffset>994833</wp:posOffset>
-                </wp:positionV>
-                <wp:extent cx="334433" cy="338667"/>
-                <wp:effectExtent l="0" t="0" r="66040" b="61595"/>
-                <wp:wrapNone/>
-                <wp:docPr id="217237716" name="Straight Arrow Connector 10"/>
-                <wp:cNvGraphicFramePr/>
-                <a:graphic xmlns:a="http://schemas.openxmlformats.org/drawingml/2006/main">
-                  <a:graphicData uri="http://schemas.microsoft.com/office/word/2010/wordprocessingShape">
-                    <wps:wsp>
-                      <wps:cNvCnPr/>
-                      <wps:spPr>
-                        <a:xfrm>
-                          <a:off x="0" y="0"/>
-                          <a:ext cx="334433" cy="338667"/>
-                        </a:xfrm>
-                        <a:prstGeom prst="straightConnector1">
-                          <a:avLst/>
-                        </a:prstGeom>
-                        <a:ln>
-                          <a:tailEnd type="triangle"/>
-                        </a:ln>
-                      </wps:spPr>
-                      <wps:style>
-                        <a:lnRef idx="2">
-                          <a:schemeClr val="dk1"/>
-                        </a:lnRef>
-                        <a:fillRef idx="0">
-                          <a:schemeClr val="dk1"/>
-                        </a:fillRef>
-                        <a:effectRef idx="1">
-                          <a:schemeClr val="dk1"/>
-                        </a:effectRef>
-                        <a:fontRef idx="minor">
-                          <a:schemeClr val="tx1"/>
-                        </a:fontRef>
-                      </wps:style>
-                      <wps:bodyPr/>
-                    </wps:wsp>
-                  </a:graphicData>
-                </a:graphic>
-              </wp:anchor>
-            </w:drawing>
-          </mc:Choice>
-          <mc:Fallback>
-            <w:pict>
-              <v:shape w14:anchorId="0E12E67D" id="Straight Arrow Connector 10" o:spid="_x0000_s1026" type="#_x0000_t32" style="position:absolute;margin-left:292.65pt;margin-top:78.35pt;width:26.35pt;height:26.65pt;z-index:251675648;visibility:visible;mso-wrap-style:square;mso-wrap-distance-left:9pt;mso-wrap-distance-top:0;mso-wrap-distance-right:9pt;mso-wrap-distance-bottom:0;mso-position-horizontal:absolute;mso-position-horizontal-relative:text;mso-position-vertical:absolute;mso-position-vertical-relative:text" o:gfxdata="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" strokecolor="black [3200]" strokeweight="1.5pt">
-                <v:stroke endarrow="block" joinstyle="miter"/>
-              </v:shape>
-            </w:pict>
-          </mc:Fallback>
-        </mc:AlternateContent>
-      </w:r>
-      <w:r>
-        <w:rPr>
-          <w:noProof/>
-        </w:rPr>
-        <mc:AlternateContent>
-          <mc:Choice Requires="wps">
-            <w:drawing>
-              <wp:anchor distT="0" distB="0" distL="114300" distR="114300" simplePos="0" relativeHeight="251674624" behindDoc="0" locked="0" layoutInCell="1" allowOverlap="1" wp14:anchorId="6BA3E7BF" wp14:editId="5E19CDFC">
-                <wp:simplePos x="0" y="0"/>
-                <wp:positionH relativeFrom="column">
-                  <wp:posOffset>3733800</wp:posOffset>
-                </wp:positionH>
-                <wp:positionV relativeFrom="paragraph">
-                  <wp:posOffset>664633</wp:posOffset>
-                </wp:positionV>
-                <wp:extent cx="452967" cy="12700"/>
-                <wp:effectExtent l="0" t="57150" r="23495" b="101600"/>
-                <wp:wrapNone/>
-                <wp:docPr id="1543425407" name="Straight Arrow Connector 9"/>
-                <wp:cNvGraphicFramePr/>
-                <a:graphic xmlns:a="http://schemas.openxmlformats.org/drawingml/2006/main">
-                  <a:graphicData uri="http://schemas.microsoft.com/office/word/2010/wordprocessingShape">
-                    <wps:wsp>
-                      <wps:cNvCnPr/>
-                      <wps:spPr>
-                        <a:xfrm>
-                          <a:off x="0" y="0"/>
-                          <a:ext cx="452967" cy="12700"/>
-                        </a:xfrm>
-                        <a:prstGeom prst="straightConnector1">
-                          <a:avLst/>
-                        </a:prstGeom>
-                        <a:ln>
-                          <a:tailEnd type="triangle"/>
-                        </a:ln>
-                      </wps:spPr>
-                      <wps:style>
-                        <a:lnRef idx="2">
-                          <a:schemeClr val="dk1"/>
-                        </a:lnRef>
-                        <a:fillRef idx="0">
-                          <a:schemeClr val="dk1"/>
-                        </a:fillRef>
-                        <a:effectRef idx="1">
-                          <a:schemeClr val="dk1"/>
-                        </a:effectRef>
-                        <a:fontRef idx="minor">
-                          <a:schemeClr val="tx1"/>
-                        </a:fontRef>
-                      </wps:style>
-                      <wps:bodyPr/>
-                    </wps:wsp>
-                  </a:graphicData>
-                </a:graphic>
-              </wp:anchor>
-            </w:drawing>
-          </mc:Choice>
-          <mc:Fallback>
-            <w:pict>
-              <v:shape w14:anchorId="5570A3FA" id="Straight Arrow Connector 9" o:spid="_x0000_s1026" type="#_x0000_t32" style="position:absolute;margin-left:294pt;margin-top:52.35pt;width:35.65pt;height:1pt;z-index:251674624;visibility:visible;mso-wrap-style:square;mso-wrap-distance-left:9pt;mso-wrap-distance-top:0;mso-wrap-distance-right:9pt;mso-wrap-distance-bottom:0;mso-position-horizontal:absolute;mso-position-horizontal-relative:text;mso-position-vertical:absolute;mso-position-vertical-relative:text" o:gfxdata="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" strokecolor="black [3200]" strokeweight="1.5pt">
-                <v:stroke endarrow="block" joinstyle="miter"/>
-              </v:shape>
-            </w:pict>
-          </mc:Fallback>
-        </mc:AlternateContent>
-      </w:r>
-      <w:r>
-        <w:rPr>
-          <w:noProof/>
-        </w:rPr>
-        <mc:AlternateContent>
-          <mc:Choice Requires="wps">
-            <w:drawing>
-              <wp:anchor distT="0" distB="0" distL="114300" distR="114300" simplePos="0" relativeHeight="251672576" behindDoc="0" locked="0" layoutInCell="1" allowOverlap="1" wp14:anchorId="54AED70A" wp14:editId="3CEB5A50">
-                <wp:simplePos x="0" y="0"/>
-                <wp:positionH relativeFrom="column">
-                  <wp:posOffset>3128433</wp:posOffset>
-                </wp:positionH>
-                <wp:positionV relativeFrom="paragraph">
-                  <wp:posOffset>-427567</wp:posOffset>
-                </wp:positionV>
-                <wp:extent cx="732367" cy="2273300"/>
-                <wp:effectExtent l="0" t="0" r="10795" b="12700"/>
-                <wp:wrapNone/>
-                <wp:docPr id="2133154812" name="Rectangle: Rounded Corners 7"/>
-                <wp:cNvGraphicFramePr/>
-                <a:graphic xmlns:a="http://schemas.openxmlformats.org/drawingml/2006/main">
-                  <a:graphicData uri="http://schemas.microsoft.com/office/word/2010/wordprocessingShape">
-                    <wps:wsp>
-                      <wps:cNvSpPr/>
-                      <wps:spPr>
-                        <a:xfrm>
-                          <a:off x="0" y="0"/>
-                          <a:ext cx="732367" cy="2273300"/>
-                        </a:xfrm>
-                        <a:prstGeom prst="roundRect">
-                          <a:avLst/>
-                        </a:prstGeom>
-                        <a:solidFill>
-                          <a:schemeClr val="accent3">
-                            <a:lumMod val="20000"/>
-                            <a:lumOff val="80000"/>
-                          </a:schemeClr>
-                        </a:solidFill>
-                      </wps:spPr>
-                      <wps:style>
-                        <a:lnRef idx="2">
-                          <a:schemeClr val="accent1">
-                            <a:shade val="15000"/>
-                          </a:schemeClr>
-                        </a:lnRef>
-                        <a:fillRef idx="1">
-                          <a:schemeClr val="accent1"/>
-                        </a:fillRef>
-                        <a:effectRef idx="0">
-                          <a:schemeClr val="accent1"/>
-                        </a:effectRef>
-                        <a:fontRef idx="minor">
-                          <a:schemeClr val="lt1"/>
-                        </a:fontRef>
-                      </wps:style>
-                      <wps:txbx>
-                        <w:txbxContent>
-                          <w:p>
-                            <w:pPr>
-                              <w:jc w:val="center"/>
-                              <w:rPr>
-                                <w:color w:val="000000" w:themeColor="text1"/>
-                                <w14:shadow w14:blurRad="38100" w14:dist="19050" w14:dir="2700000" w14:sx="100000" w14:sy="100000" w14:kx="0" w14:ky="0" w14:algn="tl">
-                                  <w14:schemeClr w14:val="dk1">
-                                    <w14:alpha w14:val="60000"/>
-                                  </w14:schemeClr>
-                                </w14:shadow>
-                                <w14:textOutline w14:w="0" w14:cap="flat" w14:cmpd="sng" w14:algn="ctr">
-                                  <w14:noFill/>
-                                  <w14:prstDash w14:val="solid"/>
-                                  <w14:round/>
-                                </w14:textOutline>
-                              </w:rPr>
-                            </w:pPr>
-                            <w:r>
-                              <w:rPr>
-                                <w:color w:val="000000" w:themeColor="text1"/>
-                                <w14:shadow w14:blurRad="38100" w14:dist="19050" w14:dir="2700000" w14:sx="100000" w14:sy="100000" w14:kx="0" w14:ky="0" w14:algn="tl">
-                                  <w14:schemeClr w14:val="dk1">
-                                    <w14:alpha w14:val="60000"/>
-                                  </w14:schemeClr>
-                                </w14:shadow>
-                                <w14:textOutline w14:w="0" w14:cap="flat" w14:cmpd="sng" w14:algn="ctr">
-                                  <w14:noFill/>
-                                  <w14:prstDash w14:val="solid"/>
-                                  <w14:round/>
-                                </w14:textOutline>
-                              </w:rPr>
-                              <w:t>Prop1</w:t>
-                            </w:r>
-                          </w:p>
-                          <w:p>
-                            <w:pPr>
-                              <w:jc w:val="center"/>
-                              <w:rPr>
-                                <w:color w:val="000000" w:themeColor="text1"/>
-                                <w14:shadow w14:blurRad="38100" w14:dist="19050" w14:dir="2700000" w14:sx="100000" w14:sy="100000" w14:kx="0" w14:ky="0" w14:algn="tl">
-                                  <w14:schemeClr w14:val="dk1">
-                                    <w14:alpha w14:val="60000"/>
-                                  </w14:schemeClr>
-                                </w14:shadow>
-                                <w14:textOutline w14:w="0" w14:cap="flat" w14:cmpd="sng" w14:algn="ctr">
-                                  <w14:noFill/>
-                                  <w14:prstDash w14:val="solid"/>
-                                  <w14:round/>
-                                </w14:textOutline>
-                              </w:rPr>
-                            </w:pPr>
-                            <w:r>
-                              <w:rPr>
-                                <w:color w:val="000000" w:themeColor="text1"/>
-                                <w14:shadow w14:blurRad="38100" w14:dist="19050" w14:dir="2700000" w14:sx="100000" w14:sy="100000" w14:kx="0" w14:ky="0" w14:algn="tl">
-                                  <w14:schemeClr w14:val="dk1">
-                                    <w14:alpha w14:val="60000"/>
-                                  </w14:schemeClr>
-                                </w14:shadow>
-                                <w14:textOutline w14:w="0" w14:cap="flat" w14:cmpd="sng" w14:algn="ctr">
-                                  <w14:noFill/>
-                                  <w14:prstDash w14:val="solid"/>
-                                  <w14:round/>
-                                </w14:textOutline>
-                              </w:rPr>
-                              <w:t>Prop2</w:t>
-                            </w:r>
-                          </w:p>
-                          <w:p>
-                            <w:pPr>
-                              <w:jc w:val="center"/>
-                              <w:rPr>
-                                <w:color w:val="000000" w:themeColor="text1"/>
-                                <w14:shadow w14:blurRad="38100" w14:dist="19050" w14:dir="2700000" w14:sx="100000" w14:sy="100000" w14:kx="0" w14:ky="0" w14:algn="tl">
-                                  <w14:schemeClr w14:val="dk1">
-                                    <w14:alpha w14:val="60000"/>
-                                  </w14:schemeClr>
-                                </w14:shadow>
-                                <w14:textOutline w14:w="0" w14:cap="flat" w14:cmpd="sng" w14:algn="ctr">
-                                  <w14:noFill/>
-                                  <w14:prstDash w14:val="solid"/>
-                                  <w14:round/>
-                                </w14:textOutline>
-                              </w:rPr>
-                            </w:pPr>
-                            <w:r>
-                              <w:rPr>
-                                <w:color w:val="000000" w:themeColor="text1"/>
-                                <w14:shadow w14:blurRad="38100" w14:dist="19050" w14:dir="2700000" w14:sx="100000" w14:sy="100000" w14:kx="0" w14:ky="0" w14:algn="tl">
-                                  <w14:schemeClr w14:val="dk1">
-                                    <w14:alpha w14:val="60000"/>
-                                  </w14:schemeClr>
-                                </w14:shadow>
-                                <w14:textOutline w14:w="0" w14:cap="flat" w14:cmpd="sng" w14:algn="ctr">
-                                  <w14:noFill/>
-                                  <w14:prstDash w14:val="solid"/>
-                                  <w14:round/>
-                                </w14:textOutline>
-                              </w:rPr>
-                              <w:t>Prop3</w:t>
-                            </w:r>
-                          </w:p>
-                        </w:txbxContent>
-                      </wps:txbx>
-                      <wps:bodyPr rot="0" spcFirstLastPara="0" vertOverflow="overflow" horzOverflow="overflow" vert="horz" wrap="square" lIns="91440" tIns="45720" rIns="91440" bIns="45720" numCol="1" spcCol="0" rtlCol="0" fromWordArt="0" anchor="ctr" anchorCtr="0" forceAA="0" compatLnSpc="1">
-                        <a:prstTxWarp prst="textNoShape">
-                          <a:avLst/>
-                        </a:prstTxWarp>
-                        <a:noAutofit/>
-                      </wps:bodyPr>
-                    </wps:wsp>
-                  </a:graphicData>
-                </a:graphic>
-              </wp:anchor>
-            </w:drawing>
-          </mc:Choice>
-          <mc:Fallback>
-            <w:pict>
-              <v:roundrect w14:anchorId="54AED70A" id="Rectangle: Rounded Corners 7" o:spid="_x0000_s1032" style="position:absolute;margin-left:246.35pt;margin-top:-33.65pt;width:57.65pt;height:179pt;z-index:251672576;visibility:visible;mso-wrap-style:square;mso-wrap-distance-left:9pt;mso-wrap-distance-top:0;mso-wrap-distance-right:9pt;mso-wrap-distance-bottom:0;mso-position-horizontal:absolute;mso-position-horizontal-relative:text;mso-position-vertical:absolute;mso-position-vertical-relative:text;v-text-anchor:middle" arcsize="10923f" o:gfxdata="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" fillcolor="#c1f0c7 [662]" strokecolor="#030e13 [484]" strokeweight="1.5pt">
-                <v:stroke joinstyle="miter"/>
-                <v:textbox>
-                  <w:txbxContent>
-                    <w:p>
-                      <w:pPr>
-                        <w:jc w:val="center"/>
-                        <w:rPr>
-                          <w:color w:val="000000" w:themeColor="text1"/>
-                          <w14:shadow w14:blurRad="38100" w14:dist="19050" w14:dir="2700000" w14:sx="100000" w14:sy="100000" w14:kx="0" w14:ky="0" w14:algn="tl">
-                            <w14:schemeClr w14:val="dk1">
-                              <w14:alpha w14:val="60000"/>
-                            </w14:schemeClr>
-                          </w14:shadow>
-                          <w14:textOutline w14:w="0" w14:cap="flat" w14:cmpd="sng" w14:algn="ctr">
-                            <w14:noFill/>
-                            <w14:prstDash w14:val="solid"/>
-                            <w14:round/>
-                          </w14:textOutline>
-                        </w:rPr>
-                      </w:pPr>
-                      <w:r>
-                        <w:rPr>
-                          <w:color w:val="000000" w:themeColor="text1"/>
-                          <w14:shadow w14:blurRad="38100" w14:dist="19050" w14:dir="2700000" w14:sx="100000" w14:sy="100000" w14:kx="0" w14:ky="0" w14:algn="tl">
-                            <w14:schemeClr w14:val="dk1">
-                              <w14:alpha w14:val="60000"/>
-                            </w14:schemeClr>
-                          </w14:shadow>
-                          <w14:textOutline w14:w="0" w14:cap="flat" w14:cmpd="sng" w14:algn="ctr">
-                            <w14:noFill/>
-                            <w14:prstDash w14:val="solid"/>
-                            <w14:round/>
-                          </w14:textOutline>
-                        </w:rPr>
-                        <w:t>Prop1</w:t>
-                      </w:r>
-                    </w:p>
-                    <w:p>
-                      <w:pPr>
-                        <w:jc w:val="center"/>
-                        <w:rPr>
-                          <w:color w:val="000000" w:themeColor="text1"/>
-                          <w14:shadow w14:blurRad="38100" w14:dist="19050" w14:dir="2700000" w14:sx="100000" w14:sy="100000" w14:kx="0" w14:ky="0" w14:algn="tl">
-                            <w14:schemeClr w14:val="dk1">
-                              <w14:alpha w14:val="60000"/>
-                            </w14:schemeClr>
-                          </w14:shadow>
-                          <w14:textOutline w14:w="0" w14:cap="flat" w14:cmpd="sng" w14:algn="ctr">
-                            <w14:noFill/>
-                            <w14:prstDash w14:val="solid"/>
-                            <w14:round/>
-                          </w14:textOutline>
-                        </w:rPr>
-                      </w:pPr>
-                      <w:r>
-                        <w:rPr>
-                          <w:color w:val="000000" w:themeColor="text1"/>
-                          <w14:shadow w14:blurRad="38100" w14:dist="19050" w14:dir="2700000" w14:sx="100000" w14:sy="100000" w14:kx="0" w14:ky="0" w14:algn="tl">
-                            <w14:schemeClr w14:val="dk1">
-                              <w14:alpha w14:val="60000"/>
-                            </w14:schemeClr>
-                          </w14:shadow>
-                          <w14:textOutline w14:w="0" w14:cap="flat" w14:cmpd="sng" w14:algn="ctr">
-                            <w14:noFill/>
-                            <w14:prstDash w14:val="solid"/>
-                            <w14:round/>
-                          </w14:textOutline>
-                        </w:rPr>
-                        <w:t>Prop2</w:t>
-                      </w:r>
-                    </w:p>
-                    <w:p>
-                      <w:pPr>
-                        <w:jc w:val="center"/>
-                        <w:rPr>
-                          <w:color w:val="000000" w:themeColor="text1"/>
-                          <w14:shadow w14:blurRad="38100" w14:dist="19050" w14:dir="2700000" w14:sx="100000" w14:sy="100000" w14:kx="0" w14:ky="0" w14:algn="tl">
-                            <w14:schemeClr w14:val="dk1">
-                              <w14:alpha w14:val="60000"/>
-                            </w14:schemeClr>
-                          </w14:shadow>
-                          <w14:textOutline w14:w="0" w14:cap="flat" w14:cmpd="sng" w14:algn="ctr">
-                            <w14:noFill/>
-                            <w14:prstDash w14:val="solid"/>
-                            <w14:round/>
-                          </w14:textOutline>
-                        </w:rPr>
-                      </w:pPr>
-                      <w:r>
-                        <w:rPr>
-                          <w:color w:val="000000" w:themeColor="text1"/>
-                          <w14:shadow w14:blurRad="38100" w14:dist="19050" w14:dir="2700000" w14:sx="100000" w14:sy="100000" w14:kx="0" w14:ky="0" w14:algn="tl">
-                            <w14:schemeClr w14:val="dk1">
-                              <w14:alpha w14:val="60000"/>
-                            </w14:schemeClr>
-                          </w14:shadow>
-                          <w14:textOutline w14:w="0" w14:cap="flat" w14:cmpd="sng" w14:algn="ctr">
-                            <w14:noFill/>
-                            <w14:prstDash w14:val="solid"/>
-                            <w14:round/>
-                          </w14:textOutline>
-                        </w:rPr>
-                        <w:t>Prop3</w:t>
-                      </w:r>
-                    </w:p>
-                  </w:txbxContent>
-                </v:textbox>
-              </v:roundrect>
             </w:pict>
           </mc:Fallback>
         </mc:AlternateContent>
@@ -2085,110 +3070,16 @@
                                 <w:szCs w:val="20"/>
                               </w:rPr>
                             </w:pPr>
+                            <w:proofErr w:type="spellStart"/>
                             <w:r>
                               <w:rPr>
                                 <w:color w:val="000000" w:themeColor="text1"/>
                                 <w:sz w:val="20"/>
                                 <w:szCs w:val="20"/>
                               </w:rPr>
-                              <w:t>Function r1(</w:t>
-                            </w:r>
-                            <w:r>
-                              <w:rPr>
-                                <w:color w:val="000000" w:themeColor="text1"/>
-                                <w:sz w:val="20"/>
-                                <w:szCs w:val="20"/>
-                              </w:rPr>
-                              <w:t>prev</w:t>
-                            </w:r>
-                            <w:r>
-                              <w:rPr>
-                                <w:color w:val="000000" w:themeColor="text1"/>
-                                <w:sz w:val="20"/>
-                                <w:szCs w:val="20"/>
-                              </w:rPr>
-                              <w:t>state,</w:t>
-                            </w:r>
-                            <w:r>
-                              <w:rPr>
-                                <w:color w:val="000000" w:themeColor="text1"/>
-                                <w:sz w:val="20"/>
-                                <w:szCs w:val="20"/>
-                              </w:rPr>
-                              <w:t xml:space="preserve"> </w:t>
-                            </w:r>
-                            <w:r>
-                              <w:rPr>
-                                <w:color w:val="000000" w:themeColor="text1"/>
-                                <w:sz w:val="20"/>
-                                <w:szCs w:val="20"/>
-                              </w:rPr>
-                              <w:t>action</w:t>
-                            </w:r>
-                            <w:r>
-                              <w:rPr>
-                                <w:color w:val="000000" w:themeColor="text1"/>
-                                <w:sz w:val="20"/>
-                                <w:szCs w:val="20"/>
-                              </w:rPr>
-                              <w:t xml:space="preserve"> </w:t>
-                            </w:r>
-                            <w:r>
-                              <w:rPr>
-                                <w:color w:val="000000" w:themeColor="text1"/>
-                                <w:sz w:val="20"/>
-                                <w:szCs w:val="20"/>
-                              </w:rPr>
-                              <w:t>)</w:t>
-                            </w:r>
-                            <w:r>
-                              <w:rPr>
-                                <w:color w:val="000000" w:themeColor="text1"/>
-                                <w:sz w:val="20"/>
-                                <w:szCs w:val="20"/>
-                              </w:rPr>
-                              <w:t xml:space="preserve"> </w:t>
-                            </w:r>
-                            <w:r>
-                              <w:rPr>
-                                <w:color w:val="000000" w:themeColor="text1"/>
-                                <w:sz w:val="20"/>
-                                <w:szCs w:val="20"/>
-                              </w:rPr>
-                              <w:t>{</w:t>
-                            </w:r>
-                            <w:r>
-                              <w:rPr>
-                                <w:color w:val="000000" w:themeColor="text1"/>
-                                <w:sz w:val="20"/>
-                                <w:szCs w:val="20"/>
-                              </w:rPr>
-                              <w:t xml:space="preserve"> </w:t>
-                            </w:r>
-                            <w:r>
-                              <w:rPr>
-                                <w:color w:val="000000" w:themeColor="text1"/>
-                                <w:sz w:val="20"/>
-                                <w:szCs w:val="20"/>
-                              </w:rPr>
-                              <w:t xml:space="preserve"> </w:t>
-                            </w:r>
-                            <w:r>
-                              <w:rPr>
-                                <w:color w:val="000000" w:themeColor="text1"/>
-                                <w:sz w:val="20"/>
-                                <w:szCs w:val="20"/>
-                              </w:rPr>
-                              <w:t xml:space="preserve">//code </w:t>
-                            </w:r>
-                            <w:r>
-                              <w:rPr>
-                                <w:color w:val="000000" w:themeColor="text1"/>
-                                <w:sz w:val="20"/>
-                                <w:szCs w:val="20"/>
-                              </w:rPr>
-                              <w:t>}</w:t>
-                            </w:r>
+                              <w:t>countReducer</w:t>
+                            </w:r>
+                            <w:proofErr w:type="spellEnd"/>
                           </w:p>
                         </w:txbxContent>
                       </wps:txbx>
@@ -2212,7 +3103,7 @@
           </mc:Choice>
           <mc:Fallback>
             <w:pict>
-              <v:rect w14:anchorId="4EE5FCD9" id="Rectangle 4" o:spid="_x0000_s1033" style="position:absolute;margin-left:308.95pt;margin-top:-33.3pt;width:100.25pt;height:61.65pt;z-index:251666432;visibility:visible;mso-wrap-style:square;mso-width-percent:0;mso-height-percent:0;mso-wrap-distance-left:9pt;mso-wrap-distance-top:0;mso-wrap-distance-right:9pt;mso-wrap-distance-bottom:0;mso-position-horizontal:absolute;mso-position-horizontal-relative:text;mso-position-vertical:absolute;mso-position-vertical-relative:text;mso-width-percent:0;mso-height-percent:0;mso-width-relative:margin;mso-height-relative:margin;v-text-anchor:middle" o:gfxdata="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" fillcolor="#f1a983 [1941]" strokecolor="#030e13 [484]" strokeweight="1.5pt">
+              <v:rect w14:anchorId="4EE5FCD9" id="Rectangle 4" o:spid="_x0000_s1038" style="position:absolute;margin-left:308.95pt;margin-top:-33.3pt;width:100.25pt;height:61.65pt;z-index:251666432;visibility:visible;mso-wrap-style:square;mso-width-percent:0;mso-height-percent:0;mso-wrap-distance-left:9pt;mso-wrap-distance-top:0;mso-wrap-distance-right:9pt;mso-wrap-distance-bottom:0;mso-position-horizontal:absolute;mso-position-horizontal-relative:text;mso-position-vertical:absolute;mso-position-vertical-relative:text;mso-width-percent:0;mso-height-percent:0;mso-width-relative:margin;mso-height-relative:margin;v-text-anchor:middle" o:gfxdata="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" fillcolor="#f1a983 [1941]" strokecolor="#030e13 [484]" strokeweight="1.5pt">
                 <v:textbox>
                   <w:txbxContent>
                     <w:p>
@@ -2224,110 +3115,16 @@
                           <w:szCs w:val="20"/>
                         </w:rPr>
                       </w:pPr>
+                      <w:proofErr w:type="spellStart"/>
                       <w:r>
                         <w:rPr>
                           <w:color w:val="000000" w:themeColor="text1"/>
                           <w:sz w:val="20"/>
                           <w:szCs w:val="20"/>
                         </w:rPr>
-                        <w:t>Function r1(</w:t>
-                      </w:r>
-                      <w:r>
-                        <w:rPr>
-                          <w:color w:val="000000" w:themeColor="text1"/>
-                          <w:sz w:val="20"/>
-                          <w:szCs w:val="20"/>
-                        </w:rPr>
-                        <w:t>prev</w:t>
-                      </w:r>
-                      <w:r>
-                        <w:rPr>
-                          <w:color w:val="000000" w:themeColor="text1"/>
-                          <w:sz w:val="20"/>
-                          <w:szCs w:val="20"/>
-                        </w:rPr>
-                        <w:t>state,</w:t>
-                      </w:r>
-                      <w:r>
-                        <w:rPr>
-                          <w:color w:val="000000" w:themeColor="text1"/>
-                          <w:sz w:val="20"/>
-                          <w:szCs w:val="20"/>
-                        </w:rPr>
-                        <w:t xml:space="preserve"> </w:t>
-                      </w:r>
-                      <w:r>
-                        <w:rPr>
-                          <w:color w:val="000000" w:themeColor="text1"/>
-                          <w:sz w:val="20"/>
-                          <w:szCs w:val="20"/>
-                        </w:rPr>
-                        <w:t>action</w:t>
-                      </w:r>
-                      <w:r>
-                        <w:rPr>
-                          <w:color w:val="000000" w:themeColor="text1"/>
-                          <w:sz w:val="20"/>
-                          <w:szCs w:val="20"/>
-                        </w:rPr>
-                        <w:t xml:space="preserve"> </w:t>
-                      </w:r>
-                      <w:r>
-                        <w:rPr>
-                          <w:color w:val="000000" w:themeColor="text1"/>
-                          <w:sz w:val="20"/>
-                          <w:szCs w:val="20"/>
-                        </w:rPr>
-                        <w:t>)</w:t>
-                      </w:r>
-                      <w:r>
-                        <w:rPr>
-                          <w:color w:val="000000" w:themeColor="text1"/>
-                          <w:sz w:val="20"/>
-                          <w:szCs w:val="20"/>
-                        </w:rPr>
-                        <w:t xml:space="preserve"> </w:t>
-                      </w:r>
-                      <w:r>
-                        <w:rPr>
-                          <w:color w:val="000000" w:themeColor="text1"/>
-                          <w:sz w:val="20"/>
-                          <w:szCs w:val="20"/>
-                        </w:rPr>
-                        <w:t>{</w:t>
-                      </w:r>
-                      <w:r>
-                        <w:rPr>
-                          <w:color w:val="000000" w:themeColor="text1"/>
-                          <w:sz w:val="20"/>
-                          <w:szCs w:val="20"/>
-                        </w:rPr>
-                        <w:t xml:space="preserve"> </w:t>
-                      </w:r>
-                      <w:r>
-                        <w:rPr>
-                          <w:color w:val="000000" w:themeColor="text1"/>
-                          <w:sz w:val="20"/>
-                          <w:szCs w:val="20"/>
-                        </w:rPr>
-                        <w:t xml:space="preserve"> </w:t>
-                      </w:r>
-                      <w:r>
-                        <w:rPr>
-                          <w:color w:val="000000" w:themeColor="text1"/>
-                          <w:sz w:val="20"/>
-                          <w:szCs w:val="20"/>
-                        </w:rPr>
-                        <w:t xml:space="preserve">//code </w:t>
-                      </w:r>
-                      <w:r>
-                        <w:rPr>
-                          <w:color w:val="000000" w:themeColor="text1"/>
-                          <w:sz w:val="20"/>
-                          <w:szCs w:val="20"/>
-                        </w:rPr>
-                        <w:t>}</w:t>
-                      </w:r>
+                        <w:t>countReducer</w:t>
+                      </w:r>
+                      <w:proofErr w:type="spellEnd"/>
                     </w:p>
                   </w:txbxContent>
                 </v:textbox>
@@ -2343,112 +3140,7 @@
         <mc:AlternateContent>
           <mc:Choice Requires="wps">
             <w:drawing>
-              <wp:anchor distT="0" distB="0" distL="114300" distR="114300" simplePos="0" relativeHeight="251670528" behindDoc="0" locked="0" layoutInCell="1" allowOverlap="1" wp14:anchorId="06F08518" wp14:editId="51ED5DDC">
-                <wp:simplePos x="0" y="0"/>
-                <wp:positionH relativeFrom="column">
-                  <wp:posOffset>3941233</wp:posOffset>
-                </wp:positionH>
-                <wp:positionV relativeFrom="paragraph">
-                  <wp:posOffset>1168400</wp:posOffset>
-                </wp:positionV>
-                <wp:extent cx="1285875" cy="668655"/>
-                <wp:effectExtent l="0" t="0" r="28575" b="17145"/>
-                <wp:wrapNone/>
-                <wp:docPr id="2103424926" name="Rectangle 4"/>
-                <wp:cNvGraphicFramePr/>
-                <a:graphic xmlns:a="http://schemas.openxmlformats.org/drawingml/2006/main">
-                  <a:graphicData uri="http://schemas.microsoft.com/office/word/2010/wordprocessingShape">
-                    <wps:wsp>
-                      <wps:cNvSpPr/>
-                      <wps:spPr>
-                        <a:xfrm>
-                          <a:off x="0" y="0"/>
-                          <a:ext cx="1285875" cy="668655"/>
-                        </a:xfrm>
-                        <a:prstGeom prst="rect">
-                          <a:avLst/>
-                        </a:prstGeom>
-                        <a:solidFill>
-                          <a:schemeClr val="accent2">
-                            <a:lumMod val="60000"/>
-                            <a:lumOff val="40000"/>
-                          </a:schemeClr>
-                        </a:solidFill>
-                      </wps:spPr>
-                      <wps:style>
-                        <a:lnRef idx="2">
-                          <a:schemeClr val="accent1">
-                            <a:shade val="15000"/>
-                          </a:schemeClr>
-                        </a:lnRef>
-                        <a:fillRef idx="1">
-                          <a:schemeClr val="accent1"/>
-                        </a:fillRef>
-                        <a:effectRef idx="0">
-                          <a:schemeClr val="accent1"/>
-                        </a:effectRef>
-                        <a:fontRef idx="minor">
-                          <a:schemeClr val="lt1"/>
-                        </a:fontRef>
-                      </wps:style>
-                      <wps:txbx>
-                        <w:txbxContent>
-                          <w:p>
-                            <w:pPr>
-                              <w:jc w:val="center"/>
-                            </w:pPr>
-                            <w:r>
-                              <w:t>Reducer3</w:t>
-                            </w:r>
-                          </w:p>
-                        </w:txbxContent>
-                      </wps:txbx>
-                      <wps:bodyPr rot="0" spcFirstLastPara="0" vertOverflow="overflow" horzOverflow="overflow" vert="horz" wrap="square" lIns="91440" tIns="45720" rIns="91440" bIns="45720" numCol="1" spcCol="0" rtlCol="0" fromWordArt="0" anchor="ctr" anchorCtr="0" forceAA="0" compatLnSpc="1">
-                        <a:prstTxWarp prst="textNoShape">
-                          <a:avLst/>
-                        </a:prstTxWarp>
-                        <a:noAutofit/>
-                      </wps:bodyPr>
-                    </wps:wsp>
-                  </a:graphicData>
-                </a:graphic>
-                <wp14:sizeRelH relativeFrom="margin">
-                  <wp14:pctWidth>0</wp14:pctWidth>
-                </wp14:sizeRelH>
-                <wp14:sizeRelV relativeFrom="margin">
-                  <wp14:pctHeight>0</wp14:pctHeight>
-                </wp14:sizeRelV>
-              </wp:anchor>
-            </w:drawing>
-          </mc:Choice>
-          <mc:Fallback>
-            <w:pict>
-              <v:rect w14:anchorId="06F08518" id="_x0000_s1034" style="position:absolute;margin-left:310.35pt;margin-top:92pt;width:101.25pt;height:52.65pt;z-index:251670528;visibility:visible;mso-wrap-style:square;mso-width-percent:0;mso-height-percent:0;mso-wrap-distance-left:9pt;mso-wrap-distance-top:0;mso-wrap-distance-right:9pt;mso-wrap-distance-bottom:0;mso-position-horizontal:absolute;mso-position-horizontal-relative:text;mso-position-vertical:absolute;mso-position-vertical-relative:text;mso-width-percent:0;mso-height-percent:0;mso-width-relative:margin;mso-height-relative:margin;v-text-anchor:middle" o:gfxdata="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" fillcolor="#f1a983 [1941]" strokecolor="#030e13 [484]" strokeweight="1.5pt">
-                <v:textbox>
-                  <w:txbxContent>
-                    <w:p>
-                      <w:pPr>
-                        <w:jc w:val="center"/>
-                      </w:pPr>
-                      <w:r>
-                        <w:t>Reducer3</w:t>
-                      </w:r>
-                    </w:p>
-                  </w:txbxContent>
-                </v:textbox>
-              </v:rect>
-            </w:pict>
-          </mc:Fallback>
-        </mc:AlternateContent>
-      </w:r>
-      <w:r>
-        <w:rPr>
-          <w:noProof/>
-        </w:rPr>
-        <mc:AlternateContent>
-          <mc:Choice Requires="wps">
-            <w:drawing>
-              <wp:anchor distT="0" distB="0" distL="114300" distR="114300" simplePos="0" relativeHeight="251661312" behindDoc="0" locked="0" layoutInCell="1" allowOverlap="1" wp14:anchorId="29F058D2" wp14:editId="20A987D6">
+              <wp:anchor distT="0" distB="0" distL="114300" distR="114300" simplePos="0" relativeHeight="251661312" behindDoc="0" locked="0" layoutInCell="1" allowOverlap="1" wp14:anchorId="29F058D2" wp14:editId="5D8AFE48">
                 <wp:simplePos x="0" y="0"/>
                 <wp:positionH relativeFrom="column">
                   <wp:posOffset>5240020</wp:posOffset>
@@ -2533,7 +3225,25 @@
                                   <w14:round/>
                                 </w14:textOutline>
                               </w:rPr>
-                              <w:t>Count: 1</w:t>
+                              <w:t xml:space="preserve">Count: </w:t>
+                            </w:r>
+                            <w:r>
+                              <w:rPr>
+                                <w:color w:val="000000" w:themeColor="text1"/>
+                                <w:sz w:val="16"/>
+                                <w:szCs w:val="16"/>
+                                <w14:shadow w14:blurRad="38100" w14:dist="19050" w14:dir="2700000" w14:sx="100000" w14:sy="100000" w14:kx="0" w14:ky="0" w14:algn="tl">
+                                  <w14:schemeClr w14:val="dk1">
+                                    <w14:alpha w14:val="60000"/>
+                                  </w14:schemeClr>
+                                </w14:shadow>
+                                <w14:textOutline w14:w="0" w14:cap="flat" w14:cmpd="sng" w14:algn="ctr">
+                                  <w14:noFill/>
+                                  <w14:prstDash w14:val="solid"/>
+                                  <w14:round/>
+                                </w14:textOutline>
+                              </w:rPr>
+                              <w:t>0</w:t>
                             </w:r>
                           </w:p>
                         </w:txbxContent>
@@ -2558,7 +3268,7 @@
           </mc:Choice>
           <mc:Fallback>
             <w:pict>
-              <v:rect w14:anchorId="29F058D2" id="Rectangle 3" o:spid="_x0000_s1035" style="position:absolute;margin-left:412.6pt;margin-top:-32.65pt;width:93pt;height:61pt;z-index:251661312;visibility:visible;mso-wrap-style:square;mso-width-percent:0;mso-height-percent:0;mso-wrap-distance-left:9pt;mso-wrap-distance-top:0;mso-wrap-distance-right:9pt;mso-wrap-distance-bottom:0;mso-position-horizontal:absolute;mso-position-horizontal-relative:text;mso-position-vertical:absolute;mso-position-vertical-relative:text;mso-width-percent:0;mso-height-percent:0;mso-width-relative:margin;mso-height-relative:margin;v-text-anchor:middle" o:gfxdata="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" fillcolor="#47d459 [1942]" strokecolor="#030e13 [484]" strokeweight="1.5pt">
+              <v:rect w14:anchorId="29F058D2" id="Rectangle 3" o:spid="_x0000_s1039" style="position:absolute;margin-left:412.6pt;margin-top:-32.65pt;width:93pt;height:61pt;z-index:251661312;visibility:visible;mso-wrap-style:square;mso-width-percent:0;mso-height-percent:0;mso-wrap-distance-left:9pt;mso-wrap-distance-top:0;mso-wrap-distance-right:9pt;mso-wrap-distance-bottom:0;mso-position-horizontal:absolute;mso-position-horizontal-relative:text;mso-position-vertical:absolute;mso-position-vertical-relative:text;mso-width-percent:0;mso-height-percent:0;mso-width-relative:margin;mso-height-relative:margin;v-text-anchor:middle" o:gfxdata="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" fillcolor="#47d459 [1942]" strokecolor="#030e13 [484]" strokeweight="1.5pt">
                 <v:textbox>
                   <w:txbxContent>
                     <w:p>
@@ -2596,7 +3306,25 @@
                             <w14:round/>
                           </w14:textOutline>
                         </w:rPr>
-                        <w:t>Count: 1</w:t>
+                        <w:t xml:space="preserve">Count: </w:t>
+                      </w:r>
+                      <w:r>
+                        <w:rPr>
+                          <w:color w:val="000000" w:themeColor="text1"/>
+                          <w:sz w:val="16"/>
+                          <w:szCs w:val="16"/>
+                          <w14:shadow w14:blurRad="38100" w14:dist="19050" w14:dir="2700000" w14:sx="100000" w14:sy="100000" w14:kx="0" w14:ky="0" w14:algn="tl">
+                            <w14:schemeClr w14:val="dk1">
+                              <w14:alpha w14:val="60000"/>
+                            </w14:schemeClr>
+                          </w14:shadow>
+                          <w14:textOutline w14:w="0" w14:cap="flat" w14:cmpd="sng" w14:algn="ctr">
+                            <w14:noFill/>
+                            <w14:prstDash w14:val="solid"/>
+                            <w14:round/>
+                          </w14:textOutline>
+                        </w:rPr>
+                        <w:t>0</w:t>
                       </w:r>
                     </w:p>
                   </w:txbxContent>
@@ -2613,7 +3341,7 @@
         <mc:AlternateContent>
           <mc:Choice Requires="wps">
             <w:drawing>
-              <wp:anchor distT="0" distB="0" distL="114300" distR="114300" simplePos="0" relativeHeight="251671552" behindDoc="0" locked="0" layoutInCell="1" allowOverlap="1" wp14:anchorId="07CCCF3D" wp14:editId="1923CAE8">
+              <wp:anchor distT="0" distB="0" distL="114300" distR="114300" simplePos="0" relativeHeight="251671552" behindDoc="0" locked="0" layoutInCell="1" allowOverlap="1" wp14:anchorId="07CCCF3D" wp14:editId="12B45371">
                 <wp:simplePos x="0" y="0"/>
                 <wp:positionH relativeFrom="column">
                   <wp:posOffset>2341033</wp:posOffset>
@@ -2681,7 +3409,7 @@
           </mc:Choice>
           <mc:Fallback>
             <w:pict>
-              <v:rect w14:anchorId="07CCCF3D" id="Rectangle 5" o:spid="_x0000_s1036" style="position:absolute;margin-left:184.35pt;margin-top:153.35pt;width:327.95pt;height:34pt;z-index:251671552;visibility:visible;mso-wrap-style:square;mso-wrap-distance-left:9pt;mso-wrap-distance-top:0;mso-wrap-distance-right:9pt;mso-wrap-distance-bottom:0;mso-position-horizontal:absolute;mso-position-horizontal-relative:text;mso-position-vertical:absolute;mso-position-vertical-relative:text;v-text-anchor:middle" o:gfxdata="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" fillcolor="#156082 [3204]" strokecolor="#030e13 [484]" strokeweight="1.5pt">
+              <v:rect w14:anchorId="07CCCF3D" id="Rectangle 5" o:spid="_x0000_s1040" style="position:absolute;margin-left:184.35pt;margin-top:153.35pt;width:327.95pt;height:34pt;z-index:251671552;visibility:visible;mso-wrap-style:square;mso-wrap-distance-left:9pt;mso-wrap-distance-top:0;mso-wrap-distance-right:9pt;mso-wrap-distance-bottom:0;mso-position-horizontal:absolute;mso-position-horizontal-relative:text;mso-position-vertical:absolute;mso-position-vertical-relative:text;v-text-anchor:middle" o:gfxdata="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" fillcolor="#156082 [3204]" strokecolor="#030e13 [484]" strokeweight="1.5pt">
                 <v:textbox>
                   <w:txbxContent>
                     <w:p>
@@ -2706,18 +3434,18 @@
         <mc:AlternateContent>
           <mc:Choice Requires="wps">
             <w:drawing>
-              <wp:anchor distT="0" distB="0" distL="114300" distR="114300" simplePos="0" relativeHeight="251665408" behindDoc="0" locked="0" layoutInCell="1" allowOverlap="1" wp14:anchorId="7BAB18EC" wp14:editId="52056DB6">
+              <wp:anchor distT="0" distB="0" distL="114300" distR="114300" simplePos="0" relativeHeight="251663360" behindDoc="0" locked="0" layoutInCell="1" allowOverlap="1" wp14:anchorId="7EDD1F22" wp14:editId="0B937469">
                 <wp:simplePos x="0" y="0"/>
                 <wp:positionH relativeFrom="column">
-                  <wp:posOffset>5257800</wp:posOffset>
+                  <wp:posOffset>5245100</wp:posOffset>
                 </wp:positionH>
                 <wp:positionV relativeFrom="paragraph">
-                  <wp:posOffset>1163956</wp:posOffset>
+                  <wp:posOffset>389467</wp:posOffset>
                 </wp:positionV>
-                <wp:extent cx="1163320" cy="673100"/>
-                <wp:effectExtent l="0" t="0" r="17780" b="12700"/>
+                <wp:extent cx="1180465" cy="753533"/>
+                <wp:effectExtent l="0" t="0" r="19685" b="27940"/>
                 <wp:wrapNone/>
-                <wp:docPr id="180302167" name="Rectangle 3"/>
+                <wp:docPr id="619316945" name="Rectangle 3"/>
                 <wp:cNvGraphicFramePr/>
                 <a:graphic xmlns:a="http://schemas.openxmlformats.org/drawingml/2006/main">
                   <a:graphicData uri="http://schemas.microsoft.com/office/word/2010/wordprocessingShape">
@@ -2726,7 +3454,7 @@
                       <wps:spPr>
                         <a:xfrm>
                           <a:off x="0" y="0"/>
-                          <a:ext cx="1163320" cy="673100"/>
+                          <a:ext cx="1180465" cy="753533"/>
                         </a:xfrm>
                         <a:prstGeom prst="rect">
                           <a:avLst/>
@@ -2760,10 +3488,39 @@
                             <w:pPr>
                               <w:jc w:val="center"/>
                               <w:rPr>
+                                <w:color w:val="000000" w:themeColor="text1"/>
                                 <w:sz w:val="16"/>
                                 <w:szCs w:val="16"/>
+                                <w14:shadow w14:blurRad="38100" w14:dist="19050" w14:dir="2700000" w14:sx="100000" w14:sy="100000" w14:kx="0" w14:ky="0" w14:algn="tl">
+                                  <w14:schemeClr w14:val="dk1">
+                                    <w14:alpha w14:val="60000"/>
+                                  </w14:schemeClr>
+                                </w14:shadow>
+                                <w14:textOutline w14:w="0" w14:cap="flat" w14:cmpd="sng" w14:algn="ctr">
+                                  <w14:noFill/>
+                                  <w14:prstDash w14:val="solid"/>
+                                  <w14:round/>
+                                </w14:textOutline>
                               </w:rPr>
                             </w:pPr>
+                            <w:r>
+                              <w:rPr>
+                                <w:color w:val="000000" w:themeColor="text1"/>
+                                <w:sz w:val="16"/>
+                                <w:szCs w:val="16"/>
+                                <w14:shadow w14:blurRad="38100" w14:dist="19050" w14:dir="2700000" w14:sx="100000" w14:sy="100000" w14:kx="0" w14:ky="0" w14:algn="tl">
+                                  <w14:schemeClr w14:val="dk1">
+                                    <w14:alpha w14:val="60000"/>
+                                  </w14:schemeClr>
+                                </w14:shadow>
+                                <w14:textOutline w14:w="0" w14:cap="flat" w14:cmpd="sng" w14:algn="ctr">
+                                  <w14:noFill/>
+                                  <w14:prstDash w14:val="solid"/>
+                                  <w14:round/>
+                                </w14:textOutline>
+                              </w:rPr>
+                              <w:t>Name:’’</w:t>
+                            </w:r>
                           </w:p>
                         </w:txbxContent>
                       </wps:txbx>
@@ -2787,124 +3544,46 @@
           </mc:Choice>
           <mc:Fallback>
             <w:pict>
-              <v:rect w14:anchorId="7BAB18EC" id="_x0000_s1037" style="position:absolute;margin-left:414pt;margin-top:91.65pt;width:91.6pt;height:53pt;z-index:251665408;visibility:visible;mso-wrap-style:square;mso-width-percent:0;mso-height-percent:0;mso-wrap-distance-left:9pt;mso-wrap-distance-top:0;mso-wrap-distance-right:9pt;mso-wrap-distance-bottom:0;mso-position-horizontal:absolute;mso-position-horizontal-relative:text;mso-position-vertical:absolute;mso-position-vertical-relative:text;mso-width-percent:0;mso-height-percent:0;mso-width-relative:margin;mso-height-relative:margin;v-text-anchor:middle" o:gfxdata="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" fillcolor="#47d459 [1942]" strokecolor="#030e13 [484]" strokeweight="1.5pt">
+              <v:rect w14:anchorId="7EDD1F22" id="_x0000_s1041" style="position:absolute;margin-left:413pt;margin-top:30.65pt;width:92.95pt;height:59.35pt;z-index:251663360;visibility:visible;mso-wrap-style:square;mso-width-percent:0;mso-height-percent:0;mso-wrap-distance-left:9pt;mso-wrap-distance-top:0;mso-wrap-distance-right:9pt;mso-wrap-distance-bottom:0;mso-position-horizontal:absolute;mso-position-horizontal-relative:text;mso-position-vertical:absolute;mso-position-vertical-relative:text;mso-width-percent:0;mso-height-percent:0;mso-width-relative:margin;mso-height-relative:margin;v-text-anchor:middle" o:gfxdata="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" fillcolor="#47d459 [1942]" strokecolor="#030e13 [484]" strokeweight="1.5pt">
                 <v:textbox>
                   <w:txbxContent>
                     <w:p>
                       <w:pPr>
                         <w:jc w:val="center"/>
                         <w:rPr>
+                          <w:color w:val="000000" w:themeColor="text1"/>
                           <w:sz w:val="16"/>
                           <w:szCs w:val="16"/>
+                          <w14:shadow w14:blurRad="38100" w14:dist="19050" w14:dir="2700000" w14:sx="100000" w14:sy="100000" w14:kx="0" w14:ky="0" w14:algn="tl">
+                            <w14:schemeClr w14:val="dk1">
+                              <w14:alpha w14:val="60000"/>
+                            </w14:schemeClr>
+                          </w14:shadow>
+                          <w14:textOutline w14:w="0" w14:cap="flat" w14:cmpd="sng" w14:algn="ctr">
+                            <w14:noFill/>
+                            <w14:prstDash w14:val="solid"/>
+                            <w14:round/>
+                          </w14:textOutline>
                         </w:rPr>
                       </w:pPr>
-                    </w:p>
-                  </w:txbxContent>
-                </v:textbox>
-              </v:rect>
-            </w:pict>
-          </mc:Fallback>
-        </mc:AlternateContent>
-      </w:r>
-      <w:r>
-        <w:rPr>
-          <w:noProof/>
-        </w:rPr>
-        <mc:AlternateContent>
-          <mc:Choice Requires="wps">
-            <w:drawing>
-              <wp:anchor distT="0" distB="0" distL="114300" distR="114300" simplePos="0" relativeHeight="251663360" behindDoc="0" locked="0" layoutInCell="1" allowOverlap="1" wp14:anchorId="7EDD1F22" wp14:editId="5EE334D9">
-                <wp:simplePos x="0" y="0"/>
-                <wp:positionH relativeFrom="column">
-                  <wp:posOffset>5245100</wp:posOffset>
-                </wp:positionH>
-                <wp:positionV relativeFrom="paragraph">
-                  <wp:posOffset>389467</wp:posOffset>
-                </wp:positionV>
-                <wp:extent cx="1180465" cy="753533"/>
-                <wp:effectExtent l="0" t="0" r="19685" b="27940"/>
-                <wp:wrapNone/>
-                <wp:docPr id="619316945" name="Rectangle 3"/>
-                <wp:cNvGraphicFramePr/>
-                <a:graphic xmlns:a="http://schemas.openxmlformats.org/drawingml/2006/main">
-                  <a:graphicData uri="http://schemas.microsoft.com/office/word/2010/wordprocessingShape">
-                    <wps:wsp>
-                      <wps:cNvSpPr/>
-                      <wps:spPr>
-                        <a:xfrm>
-                          <a:off x="0" y="0"/>
-                          <a:ext cx="1180465" cy="753533"/>
-                        </a:xfrm>
-                        <a:prstGeom prst="rect">
-                          <a:avLst/>
-                        </a:prstGeom>
-                        <a:solidFill>
-                          <a:schemeClr val="accent3">
-                            <a:lumMod val="60000"/>
-                            <a:lumOff val="40000"/>
-                          </a:schemeClr>
-                        </a:solidFill>
-                      </wps:spPr>
-                      <wps:style>
-                        <a:lnRef idx="2">
-                          <a:schemeClr val="accent1">
-                            <a:shade val="15000"/>
-                          </a:schemeClr>
-                        </a:lnRef>
-                        <a:fillRef idx="1">
-                          <a:schemeClr val="accent1"/>
-                        </a:fillRef>
-                        <a:effectRef idx="0">
-                          <a:schemeClr val="accent1"/>
-                        </a:effectRef>
-                        <a:fontRef idx="minor">
-                          <a:schemeClr val="lt1"/>
-                        </a:fontRef>
-                      </wps:style>
-                      <wps:txbx>
-                        <w:txbxContent>
-                          <w:p>
-                            <w:pPr>
-                              <w:jc w:val="center"/>
-                              <w:rPr>
-                                <w:sz w:val="16"/>
-                                <w:szCs w:val="16"/>
-                              </w:rPr>
-                            </w:pPr>
-                          </w:p>
-                        </w:txbxContent>
-                      </wps:txbx>
-                      <wps:bodyPr rot="0" spcFirstLastPara="0" vertOverflow="overflow" horzOverflow="overflow" vert="horz" wrap="square" lIns="91440" tIns="45720" rIns="91440" bIns="45720" numCol="1" spcCol="0" rtlCol="0" fromWordArt="0" anchor="ctr" anchorCtr="0" forceAA="0" compatLnSpc="1">
-                        <a:prstTxWarp prst="textNoShape">
-                          <a:avLst/>
-                        </a:prstTxWarp>
-                        <a:noAutofit/>
-                      </wps:bodyPr>
-                    </wps:wsp>
-                  </a:graphicData>
-                </a:graphic>
-                <wp14:sizeRelH relativeFrom="margin">
-                  <wp14:pctWidth>0</wp14:pctWidth>
-                </wp14:sizeRelH>
-                <wp14:sizeRelV relativeFrom="margin">
-                  <wp14:pctHeight>0</wp14:pctHeight>
-                </wp14:sizeRelV>
-              </wp:anchor>
-            </w:drawing>
-          </mc:Choice>
-          <mc:Fallback>
-            <w:pict>
-              <v:rect w14:anchorId="7EDD1F22" id="_x0000_s1038" style="position:absolute;margin-left:413pt;margin-top:30.65pt;width:92.95pt;height:59.35pt;z-index:251663360;visibility:visible;mso-wrap-style:square;mso-width-percent:0;mso-height-percent:0;mso-wrap-distance-left:9pt;mso-wrap-distance-top:0;mso-wrap-distance-right:9pt;mso-wrap-distance-bottom:0;mso-position-horizontal:absolute;mso-position-horizontal-relative:text;mso-position-vertical:absolute;mso-position-vertical-relative:text;mso-width-percent:0;mso-height-percent:0;mso-width-relative:margin;mso-height-relative:margin;v-text-anchor:middle" o:gfxdata="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" fillcolor="#47d459 [1942]" strokecolor="#030e13 [484]" strokeweight="1.5pt">
-                <v:textbox>
-                  <w:txbxContent>
-                    <w:p>
-                      <w:pPr>
-                        <w:jc w:val="center"/>
-                        <w:rPr>
+                      <w:r>
+                        <w:rPr>
+                          <w:color w:val="000000" w:themeColor="text1"/>
                           <w:sz w:val="16"/>
                           <w:szCs w:val="16"/>
-                        </w:rPr>
-                      </w:pPr>
+                          <w14:shadow w14:blurRad="38100" w14:dist="19050" w14:dir="2700000" w14:sx="100000" w14:sy="100000" w14:kx="0" w14:ky="0" w14:algn="tl">
+                            <w14:schemeClr w14:val="dk1">
+                              <w14:alpha w14:val="60000"/>
+                            </w14:schemeClr>
+                          </w14:shadow>
+                          <w14:textOutline w14:w="0" w14:cap="flat" w14:cmpd="sng" w14:algn="ctr">
+                            <w14:noFill/>
+                            <w14:prstDash w14:val="solid"/>
+                            <w14:round/>
+                          </w14:textOutline>
+                        </w:rPr>
+                        <w:t>Name:’’</w:t>
+                      </w:r>
                     </w:p>
                   </w:txbxContent>
                 </v:textbox>
@@ -2973,10 +3652,22 @@
                           <w:p>
                             <w:pPr>
                               <w:jc w:val="center"/>
+                              <w:rPr>
+                                <w:color w:val="000000" w:themeColor="text1"/>
+                                <w:sz w:val="20"/>
+                                <w:szCs w:val="20"/>
+                              </w:rPr>
                             </w:pPr>
-                            <w:r>
-                              <w:t>Reducer2</w:t>
-                            </w:r>
+                            <w:proofErr w:type="spellStart"/>
+                            <w:r>
+                              <w:rPr>
+                                <w:color w:val="000000" w:themeColor="text1"/>
+                                <w:sz w:val="20"/>
+                                <w:szCs w:val="20"/>
+                              </w:rPr>
+                              <w:t>nameReducer</w:t>
+                            </w:r>
+                            <w:proofErr w:type="spellEnd"/>
                           </w:p>
                         </w:txbxContent>
                       </wps:txbx>
@@ -3000,16 +3691,28 @@
           </mc:Choice>
           <mc:Fallback>
             <w:pict>
-              <v:rect w14:anchorId="7FC4AB7D" id="_x0000_s1039" style="position:absolute;margin-left:309.95pt;margin-top:30.05pt;width:100.25pt;height:61.65pt;z-index:251668480;visibility:visible;mso-wrap-style:square;mso-width-percent:0;mso-height-percent:0;mso-wrap-distance-left:9pt;mso-wrap-distance-top:0;mso-wrap-distance-right:9pt;mso-wrap-distance-bottom:0;mso-position-horizontal:absolute;mso-position-horizontal-relative:text;mso-position-vertical:absolute;mso-position-vertical-relative:text;mso-width-percent:0;mso-height-percent:0;mso-width-relative:margin;mso-height-relative:margin;v-text-anchor:middle" o:gfxdata="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" fillcolor="#f1a983 [1941]" strokecolor="#030e13 [484]" strokeweight="1.5pt">
+              <v:rect w14:anchorId="7FC4AB7D" id="_x0000_s1042" style="position:absolute;margin-left:309.95pt;margin-top:30.05pt;width:100.25pt;height:61.65pt;z-index:251668480;visibility:visible;mso-wrap-style:square;mso-width-percent:0;mso-height-percent:0;mso-wrap-distance-left:9pt;mso-wrap-distance-top:0;mso-wrap-distance-right:9pt;mso-wrap-distance-bottom:0;mso-position-horizontal:absolute;mso-position-horizontal-relative:text;mso-position-vertical:absolute;mso-position-vertical-relative:text;mso-width-percent:0;mso-height-percent:0;mso-width-relative:margin;mso-height-relative:margin;v-text-anchor:middle" o:gfxdata="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" fillcolor="#f1a983 [1941]" strokecolor="#030e13 [484]" strokeweight="1.5pt">
                 <v:textbox>
                   <w:txbxContent>
                     <w:p>
                       <w:pPr>
                         <w:jc w:val="center"/>
+                        <w:rPr>
+                          <w:color w:val="000000" w:themeColor="text1"/>
+                          <w:sz w:val="20"/>
+                          <w:szCs w:val="20"/>
+                        </w:rPr>
                       </w:pPr>
-                      <w:r>
-                        <w:t>Reducer2</w:t>
-                      </w:r>
+                      <w:proofErr w:type="spellStart"/>
+                      <w:r>
+                        <w:rPr>
+                          <w:color w:val="000000" w:themeColor="text1"/>
+                          <w:sz w:val="20"/>
+                          <w:szCs w:val="20"/>
+                        </w:rPr>
+                        <w:t>nameReducer</w:t>
+                      </w:r>
+                      <w:proofErr w:type="spellEnd"/>
                     </w:p>
                   </w:txbxContent>
                 </v:textbox>
@@ -3497,7 +4200,7 @@
   <w:style w:type="paragraph" w:default="1" w:styleId="Normal">
     <w:name w:val="Normal"/>
     <w:qFormat/>
-    <w:rsid w:val="00885E2B"/>
+    <w:rsid w:val="00706AF0"/>
   </w:style>
   <w:style w:type="paragraph" w:styleId="Heading1">
     <w:name w:val="heading 1"/>

</xml_diff>